<commit_message>
Added mainactivity and app delegates for method channel basics and what these two files basically do
</commit_message>
<xml_diff>
--- a/flutter_more_documents/f26_part2_of_flutter_extras_of_basic.docx
+++ b/flutter_more_documents/f26_part2_of_flutter_extras_of_basic.docx
@@ -61,6 +61,213 @@
         </w:rPr>
         <w:br w:type="page"/>
       </w:r>
+    </w:p>
+    <w:p>
+      <w:pPr>
+        <w:jc w:val="both"/>
+        <w:rPr>
+          <w:sz w:val="32"/>
+          <w:szCs w:val="32"/>
+        </w:rPr>
+      </w:pPr>
+    </w:p>
+    <w:p>
+      <w:pPr>
+        <w:jc w:val="both"/>
+        <w:rPr>
+          <w:sz w:val="32"/>
+          <w:szCs w:val="32"/>
+        </w:rPr>
+      </w:pPr>
+    </w:p>
+    <w:p>
+      <w:pPr>
+        <w:jc w:val="both"/>
+        <w:rPr>
+          <w:sz w:val="32"/>
+          <w:szCs w:val="32"/>
+        </w:rPr>
+      </w:pPr>
+    </w:p>
+    <w:p>
+      <w:pPr>
+        <w:jc w:val="both"/>
+        <w:rPr>
+          <w:sz w:val="32"/>
+          <w:szCs w:val="32"/>
+        </w:rPr>
+      </w:pPr>
+    </w:p>
+    <w:p>
+      <w:pPr>
+        <w:jc w:val="both"/>
+        <w:rPr>
+          <w:sz w:val="32"/>
+          <w:szCs w:val="32"/>
+        </w:rPr>
+      </w:pPr>
+    </w:p>
+    <w:p>
+      <w:pPr>
+        <w:jc w:val="both"/>
+        <w:rPr>
+          <w:sz w:val="32"/>
+          <w:szCs w:val="32"/>
+        </w:rPr>
+      </w:pPr>
+    </w:p>
+    <w:p>
+      <w:pPr>
+        <w:jc w:val="both"/>
+        <w:rPr>
+          <w:sz w:val="32"/>
+          <w:szCs w:val="32"/>
+        </w:rPr>
+      </w:pPr>
+    </w:p>
+    <w:p>
+      <w:pPr>
+        <w:jc w:val="both"/>
+        <w:rPr>
+          <w:sz w:val="32"/>
+          <w:szCs w:val="32"/>
+        </w:rPr>
+      </w:pPr>
+    </w:p>
+    <w:p>
+      <w:pPr>
+        <w:jc w:val="both"/>
+        <w:rPr>
+          <w:sz w:val="32"/>
+          <w:szCs w:val="32"/>
+        </w:rPr>
+      </w:pPr>
+    </w:p>
+    <w:p>
+      <w:pPr>
+        <w:jc w:val="both"/>
+        <w:rPr>
+          <w:sz w:val="32"/>
+          <w:szCs w:val="32"/>
+        </w:rPr>
+      </w:pPr>
+    </w:p>
+    <w:p>
+      <w:pPr>
+        <w:jc w:val="both"/>
+        <w:rPr>
+          <w:sz w:val="32"/>
+          <w:szCs w:val="32"/>
+        </w:rPr>
+      </w:pPr>
+    </w:p>
+    <w:p>
+      <w:pPr>
+        <w:jc w:val="both"/>
+        <w:rPr>
+          <w:sz w:val="32"/>
+          <w:szCs w:val="32"/>
+        </w:rPr>
+      </w:pPr>
+    </w:p>
+    <w:p>
+      <w:pPr>
+        <w:jc w:val="both"/>
+        <w:rPr>
+          <w:sz w:val="32"/>
+          <w:szCs w:val="32"/>
+        </w:rPr>
+      </w:pPr>
+    </w:p>
+    <w:p>
+      <w:pPr>
+        <w:jc w:val="both"/>
+        <w:rPr>
+          <w:sz w:val="32"/>
+          <w:szCs w:val="32"/>
+        </w:rPr>
+      </w:pPr>
+    </w:p>
+    <w:p>
+      <w:pPr>
+        <w:jc w:val="both"/>
+        <w:rPr>
+          <w:sz w:val="32"/>
+          <w:szCs w:val="32"/>
+        </w:rPr>
+      </w:pPr>
+    </w:p>
+    <w:p>
+      <w:pPr>
+        <w:jc w:val="both"/>
+        <w:rPr>
+          <w:sz w:val="32"/>
+          <w:szCs w:val="32"/>
+        </w:rPr>
+      </w:pPr>
+    </w:p>
+    <w:p>
+      <w:pPr>
+        <w:jc w:val="both"/>
+        <w:rPr>
+          <w:sz w:val="32"/>
+          <w:szCs w:val="32"/>
+        </w:rPr>
+      </w:pPr>
+    </w:p>
+    <w:p>
+      <w:pPr>
+        <w:jc w:val="both"/>
+        <w:rPr>
+          <w:sz w:val="32"/>
+          <w:szCs w:val="32"/>
+        </w:rPr>
+      </w:pPr>
+    </w:p>
+    <w:p>
+      <w:pPr>
+        <w:jc w:val="both"/>
+        <w:rPr>
+          <w:sz w:val="32"/>
+          <w:szCs w:val="32"/>
+        </w:rPr>
+      </w:pPr>
+    </w:p>
+    <w:p>
+      <w:pPr>
+        <w:jc w:val="both"/>
+        <w:rPr>
+          <w:sz w:val="32"/>
+          <w:szCs w:val="32"/>
+        </w:rPr>
+      </w:pPr>
+    </w:p>
+    <w:p>
+      <w:pPr>
+        <w:jc w:val="both"/>
+        <w:rPr>
+          <w:sz w:val="32"/>
+          <w:szCs w:val="32"/>
+        </w:rPr>
+      </w:pPr>
+    </w:p>
+    <w:p>
+      <w:pPr>
+        <w:jc w:val="both"/>
+        <w:rPr>
+          <w:sz w:val="32"/>
+          <w:szCs w:val="32"/>
+        </w:rPr>
+      </w:pPr>
+    </w:p>
+    <w:p>
+      <w:pPr>
+        <w:jc w:val="both"/>
+        <w:rPr>
+          <w:sz w:val="32"/>
+          <w:szCs w:val="32"/>
+        </w:rPr>
+      </w:pPr>
     </w:p>
     <w:p>
       <w:pPr>
@@ -10900,6 +11107,2419 @@
           <w:szCs w:val="32"/>
         </w:rPr>
       </w:pPr>
+      <w:proofErr w:type="spellStart"/>
+      <w:r>
+        <w:rPr>
+          <w:b/>
+          <w:bCs/>
+          <w:sz w:val="32"/>
+          <w:szCs w:val="32"/>
+        </w:rPr>
+        <w:t>MainActivity.kt</w:t>
+      </w:r>
+      <w:proofErr w:type="spellEnd"/>
+      <w:r>
+        <w:rPr>
+          <w:b/>
+          <w:bCs/>
+          <w:sz w:val="32"/>
+          <w:szCs w:val="32"/>
+        </w:rPr>
+        <w:t xml:space="preserve"> (Android) &amp; </w:t>
+      </w:r>
+      <w:proofErr w:type="spellStart"/>
+      <w:r>
+        <w:rPr>
+          <w:b/>
+          <w:bCs/>
+          <w:sz w:val="32"/>
+          <w:szCs w:val="32"/>
+        </w:rPr>
+        <w:t>AppDelegate.swift</w:t>
+      </w:r>
+      <w:proofErr w:type="spellEnd"/>
+      <w:r>
+        <w:rPr>
+          <w:b/>
+          <w:bCs/>
+          <w:sz w:val="32"/>
+          <w:szCs w:val="32"/>
+        </w:rPr>
+        <w:t xml:space="preserve"> (iOS):</w:t>
+      </w:r>
+    </w:p>
+    <w:p>
+      <w:pPr>
+        <w:jc w:val="both"/>
+        <w:rPr>
+          <w:sz w:val="32"/>
+          <w:szCs w:val="32"/>
+        </w:rPr>
+      </w:pPr>
+      <w:r>
+        <w:rPr>
+          <w:sz w:val="32"/>
+          <w:szCs w:val="32"/>
+        </w:rPr>
+        <w:t xml:space="preserve"># These two files are the bridge between </w:t>
+      </w:r>
+      <w:r>
+        <w:rPr>
+          <w:b/>
+          <w:bCs/>
+          <w:sz w:val="32"/>
+          <w:szCs w:val="32"/>
+        </w:rPr>
+        <w:t>Flutter</w:t>
+      </w:r>
+      <w:r>
+        <w:rPr>
+          <w:sz w:val="32"/>
+          <w:szCs w:val="32"/>
+        </w:rPr>
+        <w:t xml:space="preserve"> and Native Platforms (Android/iOS). </w:t>
+      </w:r>
+      <w:proofErr w:type="spellStart"/>
+      <w:r>
+        <w:rPr>
+          <w:b/>
+          <w:bCs/>
+          <w:sz w:val="32"/>
+          <w:szCs w:val="32"/>
+        </w:rPr>
+        <w:t>MethodChannel</w:t>
+      </w:r>
+      <w:r>
+        <w:rPr>
+          <w:sz w:val="32"/>
+          <w:szCs w:val="32"/>
+        </w:rPr>
+        <w:t>’s</w:t>
+      </w:r>
+      <w:proofErr w:type="spellEnd"/>
+      <w:r>
+        <w:rPr>
+          <w:sz w:val="32"/>
+          <w:szCs w:val="32"/>
+        </w:rPr>
+        <w:t xml:space="preserve"> are also implemented here.</w:t>
+      </w:r>
+    </w:p>
+    <w:p>
+      <w:pPr>
+        <w:jc w:val="both"/>
+        <w:rPr>
+          <w:sz w:val="32"/>
+          <w:szCs w:val="32"/>
+        </w:rPr>
+      </w:pPr>
+    </w:p>
+    <w:p>
+      <w:pPr>
+        <w:jc w:val="both"/>
+        <w:rPr>
+          <w:sz w:val="32"/>
+          <w:szCs w:val="32"/>
+        </w:rPr>
+      </w:pPr>
+      <w:r>
+        <w:rPr>
+          <w:sz w:val="32"/>
+          <w:szCs w:val="32"/>
+        </w:rPr>
+        <w:t xml:space="preserve">Android, </w:t>
+      </w:r>
+      <w:proofErr w:type="spellStart"/>
+      <w:r>
+        <w:rPr>
+          <w:sz w:val="32"/>
+          <w:szCs w:val="32"/>
+        </w:rPr>
+        <w:t>MainActivity.kt</w:t>
+      </w:r>
+      <w:proofErr w:type="spellEnd"/>
+      <w:r>
+        <w:rPr>
+          <w:sz w:val="32"/>
+          <w:szCs w:val="32"/>
+        </w:rPr>
+        <w:t>:</w:t>
+      </w:r>
+    </w:p>
+    <w:p>
+      <w:pPr>
+        <w:jc w:val="both"/>
+        <w:rPr>
+          <w:sz w:val="32"/>
+          <w:szCs w:val="32"/>
+        </w:rPr>
+      </w:pPr>
+      <w:r>
+        <w:rPr>
+          <w:sz w:val="32"/>
+          <w:szCs w:val="32"/>
+        </w:rPr>
+        <w:t># The main entry point for Android. Handles native features and acts as a bridge to</w:t>
+      </w:r>
+      <w:r>
+        <w:rPr>
+          <w:b/>
+          <w:bCs/>
+          <w:sz w:val="32"/>
+          <w:szCs w:val="32"/>
+        </w:rPr>
+        <w:t xml:space="preserve"> Flutter</w:t>
+      </w:r>
+      <w:r>
+        <w:rPr>
+          <w:sz w:val="32"/>
+          <w:szCs w:val="32"/>
+        </w:rPr>
+        <w:t>. Common uses:</w:t>
+      </w:r>
+    </w:p>
+    <w:p>
+      <w:pPr>
+        <w:pStyle w:val="ListParagraph"/>
+        <w:numPr>
+          <w:ilvl w:val="0"/>
+          <w:numId w:val="44"/>
+        </w:numPr>
+        <w:jc w:val="both"/>
+        <w:rPr>
+          <w:b/>
+          <w:bCs/>
+          <w:sz w:val="32"/>
+          <w:szCs w:val="32"/>
+        </w:rPr>
+      </w:pPr>
+      <w:r>
+        <w:rPr>
+          <w:sz w:val="32"/>
+          <w:szCs w:val="32"/>
+        </w:rPr>
+        <w:t xml:space="preserve">Setup </w:t>
+      </w:r>
+      <w:proofErr w:type="spellStart"/>
+      <w:proofErr w:type="gramStart"/>
+      <w:r>
+        <w:rPr>
+          <w:b/>
+          <w:bCs/>
+          <w:sz w:val="32"/>
+          <w:szCs w:val="32"/>
+        </w:rPr>
+        <w:t>MethodChannel</w:t>
+      </w:r>
+      <w:proofErr w:type="spellEnd"/>
+      <w:r>
+        <w:rPr>
+          <w:b/>
+          <w:bCs/>
+          <w:sz w:val="32"/>
+          <w:szCs w:val="32"/>
+        </w:rPr>
+        <w:t>(</w:t>
+      </w:r>
+      <w:proofErr w:type="gramEnd"/>
+      <w:r>
+        <w:rPr>
+          <w:b/>
+          <w:bCs/>
+          <w:sz w:val="32"/>
+          <w:szCs w:val="32"/>
+        </w:rPr>
+        <w:t>)</w:t>
+      </w:r>
+      <w:r>
+        <w:rPr>
+          <w:sz w:val="32"/>
+          <w:szCs w:val="32"/>
+        </w:rPr>
+        <w:t>’s</w:t>
+      </w:r>
+    </w:p>
+    <w:p>
+      <w:pPr>
+        <w:pStyle w:val="ListParagraph"/>
+        <w:numPr>
+          <w:ilvl w:val="0"/>
+          <w:numId w:val="44"/>
+        </w:numPr>
+        <w:jc w:val="both"/>
+        <w:rPr>
+          <w:sz w:val="32"/>
+          <w:szCs w:val="32"/>
+        </w:rPr>
+      </w:pPr>
+      <w:r>
+        <w:rPr>
+          <w:sz w:val="32"/>
+          <w:szCs w:val="32"/>
+        </w:rPr>
+        <w:t>Receive Android intents (deep links, share actions)</w:t>
+      </w:r>
+    </w:p>
+    <w:p>
+      <w:pPr>
+        <w:pStyle w:val="ListParagraph"/>
+        <w:numPr>
+          <w:ilvl w:val="0"/>
+          <w:numId w:val="44"/>
+        </w:numPr>
+        <w:jc w:val="both"/>
+        <w:rPr>
+          <w:sz w:val="32"/>
+          <w:szCs w:val="32"/>
+        </w:rPr>
+      </w:pPr>
+      <w:r>
+        <w:rPr>
+          <w:sz w:val="32"/>
+          <w:szCs w:val="32"/>
+        </w:rPr>
+        <w:t>Launch native Activities</w:t>
+      </w:r>
+      <w:r>
+        <w:rPr>
+          <w:sz w:val="32"/>
+          <w:szCs w:val="32"/>
+        </w:rPr>
+        <w:t xml:space="preserve"> (turn on mobile flash)</w:t>
+      </w:r>
+    </w:p>
+    <w:p>
+      <w:pPr>
+        <w:pStyle w:val="ListParagraph"/>
+        <w:numPr>
+          <w:ilvl w:val="0"/>
+          <w:numId w:val="44"/>
+        </w:numPr>
+        <w:jc w:val="both"/>
+        <w:rPr>
+          <w:sz w:val="32"/>
+          <w:szCs w:val="32"/>
+        </w:rPr>
+      </w:pPr>
+      <w:r>
+        <w:rPr>
+          <w:sz w:val="32"/>
+          <w:szCs w:val="32"/>
+        </w:rPr>
+        <w:t>Communicate with Android SDKs</w:t>
+      </w:r>
+    </w:p>
+    <w:p>
+      <w:pPr>
+        <w:pStyle w:val="ListParagraph"/>
+        <w:numPr>
+          <w:ilvl w:val="0"/>
+          <w:numId w:val="44"/>
+        </w:numPr>
+        <w:jc w:val="both"/>
+        <w:rPr>
+          <w:sz w:val="32"/>
+          <w:szCs w:val="32"/>
+        </w:rPr>
+      </w:pPr>
+      <w:r>
+        <w:rPr>
+          <w:sz w:val="32"/>
+          <w:szCs w:val="32"/>
+        </w:rPr>
+        <w:t>Handle permissions &amp; results</w:t>
+      </w:r>
+    </w:p>
+    <w:p>
+      <w:pPr>
+        <w:jc w:val="both"/>
+        <w:rPr>
+          <w:b/>
+          <w:bCs/>
+          <w:color w:val="D86DCB" w:themeColor="accent5" w:themeTint="99"/>
+          <w:sz w:val="32"/>
+          <w:szCs w:val="32"/>
+        </w:rPr>
+      </w:pPr>
+      <w:r>
+        <w:rPr>
+          <w:b/>
+          <w:bCs/>
+          <w:color w:val="D86DCB" w:themeColor="accent5" w:themeTint="99"/>
+          <w:sz w:val="32"/>
+          <w:szCs w:val="32"/>
+        </w:rPr>
+        <w:t>// project/android/app/</w:t>
+      </w:r>
+      <w:proofErr w:type="spellStart"/>
+      <w:r>
+        <w:rPr>
+          <w:b/>
+          <w:bCs/>
+          <w:color w:val="D86DCB" w:themeColor="accent5" w:themeTint="99"/>
+          <w:sz w:val="32"/>
+          <w:szCs w:val="32"/>
+        </w:rPr>
+        <w:t>src</w:t>
+      </w:r>
+      <w:proofErr w:type="spellEnd"/>
+      <w:r>
+        <w:rPr>
+          <w:b/>
+          <w:bCs/>
+          <w:color w:val="D86DCB" w:themeColor="accent5" w:themeTint="99"/>
+          <w:sz w:val="32"/>
+          <w:szCs w:val="32"/>
+        </w:rPr>
+        <w:t>/main/</w:t>
+      </w:r>
+      <w:proofErr w:type="spellStart"/>
+      <w:r>
+        <w:rPr>
+          <w:b/>
+          <w:bCs/>
+          <w:color w:val="D86DCB" w:themeColor="accent5" w:themeTint="99"/>
+          <w:sz w:val="32"/>
+          <w:szCs w:val="32"/>
+        </w:rPr>
+        <w:t>kotlin</w:t>
+      </w:r>
+      <w:proofErr w:type="spellEnd"/>
+      <w:r>
+        <w:rPr>
+          <w:b/>
+          <w:bCs/>
+          <w:color w:val="D86DCB" w:themeColor="accent5" w:themeTint="99"/>
+          <w:sz w:val="32"/>
+          <w:szCs w:val="32"/>
+        </w:rPr>
+        <w:t>/</w:t>
+      </w:r>
+      <w:proofErr w:type="spellStart"/>
+      <w:r>
+        <w:rPr>
+          <w:b/>
+          <w:bCs/>
+          <w:color w:val="D86DCB" w:themeColor="accent5" w:themeTint="99"/>
+          <w:sz w:val="32"/>
+          <w:szCs w:val="32"/>
+        </w:rPr>
+        <w:t>com.example.myapp</w:t>
+      </w:r>
+      <w:proofErr w:type="spellEnd"/>
+      <w:r>
+        <w:rPr>
+          <w:b/>
+          <w:bCs/>
+          <w:color w:val="D86DCB" w:themeColor="accent5" w:themeTint="99"/>
+          <w:sz w:val="32"/>
+          <w:szCs w:val="32"/>
+        </w:rPr>
+        <w:t>/</w:t>
+      </w:r>
+    </w:p>
+    <w:p>
+      <w:pPr>
+        <w:jc w:val="both"/>
+        <w:rPr>
+          <w:b/>
+          <w:bCs/>
+          <w:color w:val="D86DCB" w:themeColor="accent5" w:themeTint="99"/>
+          <w:sz w:val="32"/>
+          <w:szCs w:val="32"/>
+        </w:rPr>
+      </w:pPr>
+      <w:r>
+        <w:rPr>
+          <w:b/>
+          <w:bCs/>
+          <w:color w:val="D86DCB" w:themeColor="accent5" w:themeTint="99"/>
+          <w:sz w:val="32"/>
+          <w:szCs w:val="32"/>
+        </w:rPr>
+        <w:t xml:space="preserve">class </w:t>
+      </w:r>
+      <w:proofErr w:type="spellStart"/>
+      <w:proofErr w:type="gramStart"/>
+      <w:r>
+        <w:rPr>
+          <w:b/>
+          <w:bCs/>
+          <w:color w:val="D86DCB" w:themeColor="accent5" w:themeTint="99"/>
+          <w:sz w:val="32"/>
+          <w:szCs w:val="32"/>
+        </w:rPr>
+        <w:t>MainActivity</w:t>
+      </w:r>
+      <w:proofErr w:type="spellEnd"/>
+      <w:r>
+        <w:rPr>
+          <w:b/>
+          <w:bCs/>
+          <w:color w:val="D86DCB" w:themeColor="accent5" w:themeTint="99"/>
+          <w:sz w:val="32"/>
+          <w:szCs w:val="32"/>
+        </w:rPr>
+        <w:t xml:space="preserve"> :</w:t>
+      </w:r>
+      <w:proofErr w:type="gramEnd"/>
+      <w:r>
+        <w:rPr>
+          <w:b/>
+          <w:bCs/>
+          <w:color w:val="D86DCB" w:themeColor="accent5" w:themeTint="99"/>
+          <w:sz w:val="32"/>
+          <w:szCs w:val="32"/>
+        </w:rPr>
+        <w:t xml:space="preserve"> </w:t>
+      </w:r>
+      <w:proofErr w:type="spellStart"/>
+      <w:r>
+        <w:rPr>
+          <w:b/>
+          <w:bCs/>
+          <w:color w:val="D86DCB" w:themeColor="accent5" w:themeTint="99"/>
+          <w:sz w:val="32"/>
+          <w:szCs w:val="32"/>
+        </w:rPr>
+        <w:t>FlutterActivity</w:t>
+      </w:r>
+      <w:proofErr w:type="spellEnd"/>
+      <w:r>
+        <w:rPr>
+          <w:b/>
+          <w:bCs/>
+          <w:color w:val="D86DCB" w:themeColor="accent5" w:themeTint="99"/>
+          <w:sz w:val="32"/>
+          <w:szCs w:val="32"/>
+        </w:rPr>
+        <w:t>() {</w:t>
+      </w:r>
+    </w:p>
+    <w:p>
+      <w:pPr>
+        <w:jc w:val="both"/>
+        <w:rPr>
+          <w:b/>
+          <w:bCs/>
+          <w:color w:val="D86DCB" w:themeColor="accent5" w:themeTint="99"/>
+          <w:sz w:val="32"/>
+          <w:szCs w:val="32"/>
+        </w:rPr>
+      </w:pPr>
+      <w:r>
+        <w:rPr>
+          <w:b/>
+          <w:bCs/>
+          <w:color w:val="D86DCB" w:themeColor="accent5" w:themeTint="99"/>
+          <w:sz w:val="32"/>
+          <w:szCs w:val="32"/>
+        </w:rPr>
+        <w:t xml:space="preserve">    // Create a </w:t>
+      </w:r>
+      <w:proofErr w:type="spellStart"/>
+      <w:r>
+        <w:rPr>
+          <w:b/>
+          <w:bCs/>
+          <w:color w:val="D86DCB" w:themeColor="accent5" w:themeTint="99"/>
+          <w:sz w:val="32"/>
+          <w:szCs w:val="32"/>
+        </w:rPr>
+        <w:t>MethodChannel</w:t>
+      </w:r>
+      <w:proofErr w:type="spellEnd"/>
+    </w:p>
+    <w:p>
+      <w:pPr>
+        <w:jc w:val="both"/>
+        <w:rPr>
+          <w:b/>
+          <w:bCs/>
+          <w:color w:val="D86DCB" w:themeColor="accent5" w:themeTint="99"/>
+          <w:sz w:val="32"/>
+          <w:szCs w:val="32"/>
+        </w:rPr>
+      </w:pPr>
+      <w:r>
+        <w:rPr>
+          <w:b/>
+          <w:bCs/>
+          <w:color w:val="D86DCB" w:themeColor="accent5" w:themeTint="99"/>
+          <w:sz w:val="32"/>
+          <w:szCs w:val="32"/>
+        </w:rPr>
+        <w:t xml:space="preserve">    </w:t>
+      </w:r>
+      <w:r>
+        <w:rPr>
+          <w:b/>
+          <w:bCs/>
+          <w:color w:val="D86DCB" w:themeColor="accent5" w:themeTint="99"/>
+          <w:sz w:val="32"/>
+          <w:szCs w:val="32"/>
+        </w:rPr>
+        <w:t xml:space="preserve">override fun </w:t>
+      </w:r>
+      <w:proofErr w:type="spellStart"/>
+      <w:proofErr w:type="gramStart"/>
+      <w:r>
+        <w:rPr>
+          <w:b/>
+          <w:bCs/>
+          <w:color w:val="D86DCB" w:themeColor="accent5" w:themeTint="99"/>
+          <w:sz w:val="32"/>
+          <w:szCs w:val="32"/>
+        </w:rPr>
+        <w:t>configureFlutterEngine</w:t>
+      </w:r>
+      <w:proofErr w:type="spellEnd"/>
+      <w:r>
+        <w:rPr>
+          <w:b/>
+          <w:bCs/>
+          <w:color w:val="D86DCB" w:themeColor="accent5" w:themeTint="99"/>
+          <w:sz w:val="32"/>
+          <w:szCs w:val="32"/>
+        </w:rPr>
+        <w:t>(</w:t>
+      </w:r>
+      <w:proofErr w:type="gramEnd"/>
+    </w:p>
+    <w:p>
+      <w:pPr>
+        <w:jc w:val="both"/>
+        <w:rPr>
+          <w:b/>
+          <w:bCs/>
+          <w:color w:val="D86DCB" w:themeColor="accent5" w:themeTint="99"/>
+          <w:sz w:val="32"/>
+          <w:szCs w:val="32"/>
+        </w:rPr>
+      </w:pPr>
+      <w:r>
+        <w:rPr>
+          <w:b/>
+          <w:bCs/>
+          <w:color w:val="D86DCB" w:themeColor="accent5" w:themeTint="99"/>
+          <w:sz w:val="32"/>
+          <w:szCs w:val="32"/>
+        </w:rPr>
+        <w:t xml:space="preserve">        </w:t>
+      </w:r>
+      <w:proofErr w:type="spellStart"/>
+      <w:r>
+        <w:rPr>
+          <w:b/>
+          <w:bCs/>
+          <w:color w:val="D86DCB" w:themeColor="accent5" w:themeTint="99"/>
+          <w:sz w:val="32"/>
+          <w:szCs w:val="32"/>
+        </w:rPr>
+        <w:t>flutterEngine</w:t>
+      </w:r>
+      <w:proofErr w:type="spellEnd"/>
+      <w:r>
+        <w:rPr>
+          <w:b/>
+          <w:bCs/>
+          <w:color w:val="D86DCB" w:themeColor="accent5" w:themeTint="99"/>
+          <w:sz w:val="32"/>
+          <w:szCs w:val="32"/>
+        </w:rPr>
+        <w:t xml:space="preserve">: </w:t>
+      </w:r>
+      <w:proofErr w:type="spellStart"/>
+      <w:r>
+        <w:rPr>
+          <w:b/>
+          <w:bCs/>
+          <w:color w:val="D86DCB" w:themeColor="accent5" w:themeTint="99"/>
+          <w:sz w:val="32"/>
+          <w:szCs w:val="32"/>
+        </w:rPr>
+        <w:t>FlutterEngine</w:t>
+      </w:r>
+      <w:proofErr w:type="spellEnd"/>
+    </w:p>
+    <w:p>
+      <w:pPr>
+        <w:jc w:val="both"/>
+        <w:rPr>
+          <w:b/>
+          <w:bCs/>
+          <w:color w:val="D86DCB" w:themeColor="accent5" w:themeTint="99"/>
+          <w:sz w:val="32"/>
+          <w:szCs w:val="32"/>
+        </w:rPr>
+      </w:pPr>
+      <w:r>
+        <w:rPr>
+          <w:b/>
+          <w:bCs/>
+          <w:color w:val="D86DCB" w:themeColor="accent5" w:themeTint="99"/>
+          <w:sz w:val="32"/>
+          <w:szCs w:val="32"/>
+        </w:rPr>
+        <w:t xml:space="preserve">    </w:t>
+      </w:r>
+      <w:r>
+        <w:rPr>
+          <w:b/>
+          <w:bCs/>
+          <w:color w:val="D86DCB" w:themeColor="accent5" w:themeTint="99"/>
+          <w:sz w:val="32"/>
+          <w:szCs w:val="32"/>
+        </w:rPr>
+        <w:t>) {</w:t>
+      </w:r>
+    </w:p>
+    <w:p>
+      <w:pPr>
+        <w:jc w:val="both"/>
+        <w:rPr>
+          <w:b/>
+          <w:bCs/>
+          <w:color w:val="D86DCB" w:themeColor="accent5" w:themeTint="99"/>
+          <w:sz w:val="32"/>
+          <w:szCs w:val="32"/>
+        </w:rPr>
+      </w:pPr>
+      <w:r>
+        <w:rPr>
+          <w:b/>
+          <w:bCs/>
+          <w:color w:val="D86DCB" w:themeColor="accent5" w:themeTint="99"/>
+          <w:sz w:val="32"/>
+          <w:szCs w:val="32"/>
+        </w:rPr>
+        <w:t xml:space="preserve">        </w:t>
+      </w:r>
+      <w:proofErr w:type="spellStart"/>
+      <w:proofErr w:type="gramStart"/>
+      <w:r>
+        <w:rPr>
+          <w:b/>
+          <w:bCs/>
+          <w:color w:val="D86DCB" w:themeColor="accent5" w:themeTint="99"/>
+          <w:sz w:val="32"/>
+          <w:szCs w:val="32"/>
+        </w:rPr>
+        <w:t>super.configureFlutterEngine</w:t>
+      </w:r>
+      <w:proofErr w:type="spellEnd"/>
+      <w:proofErr w:type="gramEnd"/>
+      <w:r>
+        <w:rPr>
+          <w:b/>
+          <w:bCs/>
+          <w:color w:val="D86DCB" w:themeColor="accent5" w:themeTint="99"/>
+          <w:sz w:val="32"/>
+          <w:szCs w:val="32"/>
+        </w:rPr>
+        <w:t>(</w:t>
+      </w:r>
+      <w:proofErr w:type="spellStart"/>
+      <w:r>
+        <w:rPr>
+          <w:b/>
+          <w:bCs/>
+          <w:color w:val="D86DCB" w:themeColor="accent5" w:themeTint="99"/>
+          <w:sz w:val="32"/>
+          <w:szCs w:val="32"/>
+        </w:rPr>
+        <w:t>flutterEngine</w:t>
+      </w:r>
+      <w:proofErr w:type="spellEnd"/>
+      <w:r>
+        <w:rPr>
+          <w:b/>
+          <w:bCs/>
+          <w:color w:val="D86DCB" w:themeColor="accent5" w:themeTint="99"/>
+          <w:sz w:val="32"/>
+          <w:szCs w:val="32"/>
+        </w:rPr>
+        <w:t>)</w:t>
+      </w:r>
+    </w:p>
+    <w:p>
+      <w:pPr>
+        <w:jc w:val="both"/>
+        <w:rPr>
+          <w:b/>
+          <w:bCs/>
+          <w:color w:val="D86DCB" w:themeColor="accent5" w:themeTint="99"/>
+          <w:sz w:val="32"/>
+          <w:szCs w:val="32"/>
+        </w:rPr>
+      </w:pPr>
+      <w:r>
+        <w:rPr>
+          <w:b/>
+          <w:bCs/>
+          <w:color w:val="D86DCB" w:themeColor="accent5" w:themeTint="99"/>
+          <w:sz w:val="32"/>
+          <w:szCs w:val="32"/>
+        </w:rPr>
+        <w:lastRenderedPageBreak/>
+        <w:t xml:space="preserve">        </w:t>
+      </w:r>
+      <w:proofErr w:type="spellStart"/>
+      <w:proofErr w:type="gramStart"/>
+      <w:r>
+        <w:rPr>
+          <w:b/>
+          <w:bCs/>
+          <w:color w:val="D86DCB" w:themeColor="accent5" w:themeTint="99"/>
+          <w:sz w:val="32"/>
+          <w:szCs w:val="32"/>
+        </w:rPr>
+        <w:t>MethodChannel</w:t>
+      </w:r>
+      <w:proofErr w:type="spellEnd"/>
+      <w:r>
+        <w:rPr>
+          <w:b/>
+          <w:bCs/>
+          <w:color w:val="D86DCB" w:themeColor="accent5" w:themeTint="99"/>
+          <w:sz w:val="32"/>
+          <w:szCs w:val="32"/>
+        </w:rPr>
+        <w:t>(</w:t>
+      </w:r>
+      <w:proofErr w:type="gramEnd"/>
+    </w:p>
+    <w:p>
+      <w:pPr>
+        <w:jc w:val="both"/>
+        <w:rPr>
+          <w:b/>
+          <w:bCs/>
+          <w:color w:val="D86DCB" w:themeColor="accent5" w:themeTint="99"/>
+          <w:sz w:val="32"/>
+          <w:szCs w:val="32"/>
+        </w:rPr>
+      </w:pPr>
+      <w:r>
+        <w:rPr>
+          <w:b/>
+          <w:bCs/>
+          <w:color w:val="D86DCB" w:themeColor="accent5" w:themeTint="99"/>
+          <w:sz w:val="32"/>
+          <w:szCs w:val="32"/>
+        </w:rPr>
+        <w:t xml:space="preserve">            </w:t>
+      </w:r>
+      <w:proofErr w:type="spellStart"/>
+      <w:proofErr w:type="gramStart"/>
+      <w:r>
+        <w:rPr>
+          <w:b/>
+          <w:bCs/>
+          <w:color w:val="D86DCB" w:themeColor="accent5" w:themeTint="99"/>
+          <w:sz w:val="32"/>
+          <w:szCs w:val="32"/>
+        </w:rPr>
+        <w:t>flutterEngine.dartExecutor.binaryMessenger</w:t>
+      </w:r>
+      <w:proofErr w:type="spellEnd"/>
+      <w:proofErr w:type="gramEnd"/>
+      <w:r>
+        <w:rPr>
+          <w:b/>
+          <w:bCs/>
+          <w:color w:val="D86DCB" w:themeColor="accent5" w:themeTint="99"/>
+          <w:sz w:val="32"/>
+          <w:szCs w:val="32"/>
+        </w:rPr>
+        <w:t>,</w:t>
+      </w:r>
+    </w:p>
+    <w:p>
+      <w:pPr>
+        <w:jc w:val="both"/>
+        <w:rPr>
+          <w:b/>
+          <w:bCs/>
+          <w:color w:val="D86DCB" w:themeColor="accent5" w:themeTint="99"/>
+          <w:sz w:val="32"/>
+          <w:szCs w:val="32"/>
+        </w:rPr>
+      </w:pPr>
+      <w:r>
+        <w:rPr>
+          <w:b/>
+          <w:bCs/>
+          <w:color w:val="D86DCB" w:themeColor="accent5" w:themeTint="99"/>
+          <w:sz w:val="32"/>
+          <w:szCs w:val="32"/>
+        </w:rPr>
+        <w:t xml:space="preserve">            </w:t>
+      </w:r>
+      <w:r>
+        <w:rPr>
+          <w:b/>
+          <w:bCs/>
+          <w:color w:val="D86DCB" w:themeColor="accent5" w:themeTint="99"/>
+          <w:sz w:val="32"/>
+          <w:szCs w:val="32"/>
+        </w:rPr>
+        <w:t>“</w:t>
+      </w:r>
+      <w:proofErr w:type="spellStart"/>
+      <w:proofErr w:type="gramStart"/>
+      <w:r>
+        <w:rPr>
+          <w:b/>
+          <w:bCs/>
+          <w:color w:val="D86DCB" w:themeColor="accent5" w:themeTint="99"/>
+          <w:sz w:val="32"/>
+          <w:szCs w:val="32"/>
+        </w:rPr>
+        <w:t>com</w:t>
+      </w:r>
+      <w:proofErr w:type="gramEnd"/>
+      <w:r>
+        <w:rPr>
+          <w:b/>
+          <w:bCs/>
+          <w:color w:val="D86DCB" w:themeColor="accent5" w:themeTint="99"/>
+          <w:sz w:val="32"/>
+          <w:szCs w:val="32"/>
+        </w:rPr>
+        <w:t>.example</w:t>
+      </w:r>
+      <w:proofErr w:type="spellEnd"/>
+      <w:r>
+        <w:rPr>
+          <w:b/>
+          <w:bCs/>
+          <w:color w:val="D86DCB" w:themeColor="accent5" w:themeTint="99"/>
+          <w:sz w:val="32"/>
+          <w:szCs w:val="32"/>
+        </w:rPr>
+        <w:t>/</w:t>
+      </w:r>
+      <w:proofErr w:type="spellStart"/>
+      <w:r>
+        <w:rPr>
+          <w:b/>
+          <w:bCs/>
+          <w:color w:val="D86DCB" w:themeColor="accent5" w:themeTint="99"/>
+          <w:sz w:val="32"/>
+          <w:szCs w:val="32"/>
+        </w:rPr>
+        <w:t>myapp</w:t>
+      </w:r>
+      <w:proofErr w:type="spellEnd"/>
+      <w:r>
+        <w:rPr>
+          <w:b/>
+          <w:bCs/>
+          <w:color w:val="D86DCB" w:themeColor="accent5" w:themeTint="99"/>
+          <w:sz w:val="32"/>
+          <w:szCs w:val="32"/>
+        </w:rPr>
+        <w:t>”</w:t>
+      </w:r>
+    </w:p>
+    <w:p>
+      <w:pPr>
+        <w:jc w:val="both"/>
+        <w:rPr>
+          <w:b/>
+          <w:bCs/>
+          <w:color w:val="D86DCB" w:themeColor="accent5" w:themeTint="99"/>
+          <w:sz w:val="32"/>
+          <w:szCs w:val="32"/>
+        </w:rPr>
+      </w:pPr>
+      <w:r>
+        <w:rPr>
+          <w:b/>
+          <w:bCs/>
+          <w:color w:val="D86DCB" w:themeColor="accent5" w:themeTint="99"/>
+          <w:sz w:val="32"/>
+          <w:szCs w:val="32"/>
+        </w:rPr>
+        <w:t xml:space="preserve">        </w:t>
+      </w:r>
+      <w:proofErr w:type="gramStart"/>
+      <w:r>
+        <w:rPr>
+          <w:b/>
+          <w:bCs/>
+          <w:color w:val="D86DCB" w:themeColor="accent5" w:themeTint="99"/>
+          <w:sz w:val="32"/>
+          <w:szCs w:val="32"/>
+        </w:rPr>
+        <w:t>).</w:t>
+      </w:r>
+      <w:proofErr w:type="spellStart"/>
+      <w:r>
+        <w:rPr>
+          <w:b/>
+          <w:bCs/>
+          <w:color w:val="D86DCB" w:themeColor="accent5" w:themeTint="99"/>
+          <w:sz w:val="32"/>
+          <w:szCs w:val="32"/>
+        </w:rPr>
+        <w:t>setMethodCallHandler</w:t>
+      </w:r>
+      <w:proofErr w:type="spellEnd"/>
+      <w:proofErr w:type="gramEnd"/>
+      <w:r>
+        <w:rPr>
+          <w:b/>
+          <w:bCs/>
+          <w:color w:val="D86DCB" w:themeColor="accent5" w:themeTint="99"/>
+          <w:sz w:val="32"/>
+          <w:szCs w:val="32"/>
+        </w:rPr>
+        <w:t xml:space="preserve"> { call, result -&gt;</w:t>
+      </w:r>
+    </w:p>
+    <w:p>
+      <w:pPr>
+        <w:jc w:val="both"/>
+        <w:rPr>
+          <w:b/>
+          <w:bCs/>
+          <w:color w:val="D86DCB" w:themeColor="accent5" w:themeTint="99"/>
+          <w:sz w:val="32"/>
+          <w:szCs w:val="32"/>
+        </w:rPr>
+      </w:pPr>
+      <w:r>
+        <w:rPr>
+          <w:b/>
+          <w:bCs/>
+          <w:color w:val="D86DCB" w:themeColor="accent5" w:themeTint="99"/>
+          <w:sz w:val="32"/>
+          <w:szCs w:val="32"/>
+        </w:rPr>
+        <w:t xml:space="preserve">            </w:t>
+      </w:r>
+      <w:r>
+        <w:rPr>
+          <w:b/>
+          <w:bCs/>
+          <w:color w:val="D86DCB" w:themeColor="accent5" w:themeTint="99"/>
+          <w:sz w:val="32"/>
+          <w:szCs w:val="32"/>
+        </w:rPr>
+        <w:t>// Handle native Android Code</w:t>
+      </w:r>
+    </w:p>
+    <w:p>
+      <w:pPr>
+        <w:jc w:val="both"/>
+        <w:rPr>
+          <w:b/>
+          <w:bCs/>
+          <w:color w:val="D86DCB" w:themeColor="accent5" w:themeTint="99"/>
+          <w:sz w:val="32"/>
+          <w:szCs w:val="32"/>
+        </w:rPr>
+      </w:pPr>
+      <w:r>
+        <w:rPr>
+          <w:b/>
+          <w:bCs/>
+          <w:color w:val="D86DCB" w:themeColor="accent5" w:themeTint="99"/>
+          <w:sz w:val="32"/>
+          <w:szCs w:val="32"/>
+        </w:rPr>
+        <w:t xml:space="preserve">        </w:t>
+      </w:r>
+      <w:r>
+        <w:rPr>
+          <w:b/>
+          <w:bCs/>
+          <w:color w:val="D86DCB" w:themeColor="accent5" w:themeTint="99"/>
+          <w:sz w:val="32"/>
+          <w:szCs w:val="32"/>
+        </w:rPr>
+        <w:t>}</w:t>
+      </w:r>
+    </w:p>
+    <w:p>
+      <w:pPr>
+        <w:jc w:val="both"/>
+        <w:rPr>
+          <w:b/>
+          <w:bCs/>
+          <w:color w:val="D86DCB" w:themeColor="accent5" w:themeTint="99"/>
+          <w:sz w:val="32"/>
+          <w:szCs w:val="32"/>
+        </w:rPr>
+      </w:pPr>
+      <w:r>
+        <w:rPr>
+          <w:b/>
+          <w:bCs/>
+          <w:color w:val="D86DCB" w:themeColor="accent5" w:themeTint="99"/>
+          <w:sz w:val="32"/>
+          <w:szCs w:val="32"/>
+        </w:rPr>
+        <w:t xml:space="preserve">    </w:t>
+      </w:r>
+      <w:r>
+        <w:rPr>
+          <w:b/>
+          <w:bCs/>
+          <w:color w:val="D86DCB" w:themeColor="accent5" w:themeTint="99"/>
+          <w:sz w:val="32"/>
+          <w:szCs w:val="32"/>
+        </w:rPr>
+        <w:t>}</w:t>
+      </w:r>
+    </w:p>
+    <w:p>
+      <w:pPr>
+        <w:jc w:val="both"/>
+        <w:rPr>
+          <w:b/>
+          <w:bCs/>
+          <w:color w:val="D86DCB" w:themeColor="accent5" w:themeTint="99"/>
+          <w:sz w:val="32"/>
+          <w:szCs w:val="32"/>
+        </w:rPr>
+      </w:pPr>
+      <w:r>
+        <w:rPr>
+          <w:b/>
+          <w:bCs/>
+          <w:color w:val="D86DCB" w:themeColor="accent5" w:themeTint="99"/>
+          <w:sz w:val="32"/>
+          <w:szCs w:val="32"/>
+        </w:rPr>
+        <w:t>}</w:t>
+      </w:r>
+    </w:p>
+    <w:p>
+      <w:pPr>
+        <w:jc w:val="both"/>
+        <w:rPr>
+          <w:sz w:val="32"/>
+          <w:szCs w:val="32"/>
+        </w:rPr>
+      </w:pPr>
+    </w:p>
+    <w:p>
+      <w:pPr>
+        <w:jc w:val="both"/>
+        <w:rPr>
+          <w:sz w:val="32"/>
+          <w:szCs w:val="32"/>
+        </w:rPr>
+      </w:pPr>
+      <w:r>
+        <w:rPr>
+          <w:sz w:val="32"/>
+          <w:szCs w:val="32"/>
+        </w:rPr>
+        <w:t xml:space="preserve">iOS, </w:t>
+      </w:r>
+      <w:proofErr w:type="spellStart"/>
+      <w:r>
+        <w:rPr>
+          <w:sz w:val="32"/>
+          <w:szCs w:val="32"/>
+        </w:rPr>
+        <w:t>AppDelegate.swift</w:t>
+      </w:r>
+      <w:proofErr w:type="spellEnd"/>
+      <w:r>
+        <w:rPr>
+          <w:sz w:val="32"/>
+          <w:szCs w:val="32"/>
+        </w:rPr>
+        <w:t>:</w:t>
+      </w:r>
+    </w:p>
+    <w:p>
+      <w:pPr>
+        <w:jc w:val="both"/>
+        <w:rPr>
+          <w:sz w:val="32"/>
+          <w:szCs w:val="32"/>
+        </w:rPr>
+      </w:pPr>
+      <w:r>
+        <w:rPr>
+          <w:sz w:val="32"/>
+          <w:szCs w:val="32"/>
+        </w:rPr>
+        <w:t># The app lifecycle manager for iOS. Handles native features and acts as a bridge to</w:t>
+      </w:r>
+      <w:r>
+        <w:rPr>
+          <w:b/>
+          <w:bCs/>
+          <w:sz w:val="32"/>
+          <w:szCs w:val="32"/>
+        </w:rPr>
+        <w:t xml:space="preserve"> Flutter</w:t>
+      </w:r>
+      <w:r>
+        <w:rPr>
+          <w:sz w:val="32"/>
+          <w:szCs w:val="32"/>
+        </w:rPr>
+        <w:t>. Common uses:</w:t>
+      </w:r>
+    </w:p>
+    <w:p>
+      <w:pPr>
+        <w:pStyle w:val="ListParagraph"/>
+        <w:numPr>
+          <w:ilvl w:val="0"/>
+          <w:numId w:val="45"/>
+        </w:numPr>
+        <w:jc w:val="both"/>
+        <w:rPr>
+          <w:sz w:val="32"/>
+          <w:szCs w:val="32"/>
+        </w:rPr>
+      </w:pPr>
+      <w:r>
+        <w:rPr>
+          <w:sz w:val="32"/>
+          <w:szCs w:val="32"/>
+        </w:rPr>
+        <w:t xml:space="preserve">Register </w:t>
+      </w:r>
+      <w:r>
+        <w:rPr>
+          <w:b/>
+          <w:bCs/>
+          <w:sz w:val="32"/>
+          <w:szCs w:val="32"/>
+        </w:rPr>
+        <w:t xml:space="preserve">Flutter </w:t>
+      </w:r>
+      <w:r>
+        <w:rPr>
+          <w:sz w:val="32"/>
+          <w:szCs w:val="32"/>
+        </w:rPr>
+        <w:t>plugins</w:t>
+      </w:r>
+    </w:p>
+    <w:p>
+      <w:pPr>
+        <w:pStyle w:val="ListParagraph"/>
+        <w:numPr>
+          <w:ilvl w:val="0"/>
+          <w:numId w:val="45"/>
+        </w:numPr>
+        <w:jc w:val="both"/>
+        <w:rPr>
+          <w:sz w:val="32"/>
+          <w:szCs w:val="32"/>
+        </w:rPr>
+      </w:pPr>
+      <w:r>
+        <w:rPr>
+          <w:sz w:val="32"/>
+          <w:szCs w:val="32"/>
+        </w:rPr>
+        <w:t xml:space="preserve">Create </w:t>
+      </w:r>
+      <w:proofErr w:type="spellStart"/>
+      <w:proofErr w:type="gramStart"/>
+      <w:r>
+        <w:rPr>
+          <w:b/>
+          <w:bCs/>
+          <w:sz w:val="32"/>
+          <w:szCs w:val="32"/>
+        </w:rPr>
+        <w:t>MethodChannel</w:t>
+      </w:r>
+      <w:proofErr w:type="spellEnd"/>
+      <w:r>
+        <w:rPr>
+          <w:b/>
+          <w:bCs/>
+          <w:sz w:val="32"/>
+          <w:szCs w:val="32"/>
+        </w:rPr>
+        <w:t>(</w:t>
+      </w:r>
+      <w:proofErr w:type="gramEnd"/>
+      <w:r>
+        <w:rPr>
+          <w:b/>
+          <w:bCs/>
+          <w:sz w:val="32"/>
+          <w:szCs w:val="32"/>
+        </w:rPr>
+        <w:t>)</w:t>
+      </w:r>
+      <w:r>
+        <w:rPr>
+          <w:sz w:val="32"/>
+          <w:szCs w:val="32"/>
+        </w:rPr>
+        <w:t>’s</w:t>
+      </w:r>
+    </w:p>
+    <w:p>
+      <w:pPr>
+        <w:pStyle w:val="ListParagraph"/>
+        <w:numPr>
+          <w:ilvl w:val="0"/>
+          <w:numId w:val="45"/>
+        </w:numPr>
+        <w:jc w:val="both"/>
+        <w:rPr>
+          <w:sz w:val="32"/>
+          <w:szCs w:val="32"/>
+        </w:rPr>
+      </w:pPr>
+      <w:r>
+        <w:rPr>
+          <w:sz w:val="32"/>
+          <w:szCs w:val="32"/>
+        </w:rPr>
+        <w:t>Handle Universal Links (deep links)</w:t>
+      </w:r>
+    </w:p>
+    <w:p>
+      <w:pPr>
+        <w:pStyle w:val="ListParagraph"/>
+        <w:numPr>
+          <w:ilvl w:val="0"/>
+          <w:numId w:val="45"/>
+        </w:numPr>
+        <w:jc w:val="both"/>
+        <w:rPr>
+          <w:sz w:val="32"/>
+          <w:szCs w:val="32"/>
+        </w:rPr>
+      </w:pPr>
+      <w:r>
+        <w:rPr>
+          <w:sz w:val="32"/>
+          <w:szCs w:val="32"/>
+        </w:rPr>
+        <w:t>Receive push notification callbacks</w:t>
+      </w:r>
+    </w:p>
+    <w:p>
+      <w:pPr>
+        <w:pStyle w:val="ListParagraph"/>
+        <w:numPr>
+          <w:ilvl w:val="0"/>
+          <w:numId w:val="45"/>
+        </w:numPr>
+        <w:jc w:val="both"/>
+        <w:rPr>
+          <w:sz w:val="32"/>
+          <w:szCs w:val="32"/>
+        </w:rPr>
+      </w:pPr>
+      <w:r>
+        <w:rPr>
+          <w:sz w:val="32"/>
+          <w:szCs w:val="32"/>
+        </w:rPr>
+        <w:t>Initialize iOS SDKs</w:t>
+      </w:r>
+    </w:p>
+    <w:p>
+      <w:pPr>
+        <w:pStyle w:val="ListParagraph"/>
+        <w:numPr>
+          <w:ilvl w:val="0"/>
+          <w:numId w:val="45"/>
+        </w:numPr>
+        <w:jc w:val="both"/>
+        <w:rPr>
+          <w:sz w:val="32"/>
+          <w:szCs w:val="32"/>
+        </w:rPr>
+      </w:pPr>
+      <w:r>
+        <w:rPr>
+          <w:sz w:val="32"/>
+          <w:szCs w:val="32"/>
+        </w:rPr>
+        <w:t>Handle permissions and results</w:t>
+      </w:r>
+    </w:p>
+    <w:p>
+      <w:pPr>
+        <w:jc w:val="both"/>
+        <w:rPr>
+          <w:b/>
+          <w:bCs/>
+          <w:color w:val="D86DCB" w:themeColor="accent5" w:themeTint="99"/>
+          <w:sz w:val="32"/>
+          <w:szCs w:val="32"/>
+        </w:rPr>
+      </w:pPr>
+      <w:r>
+        <w:rPr>
+          <w:b/>
+          <w:bCs/>
+          <w:color w:val="D86DCB" w:themeColor="accent5" w:themeTint="99"/>
+          <w:sz w:val="32"/>
+          <w:szCs w:val="32"/>
+        </w:rPr>
+        <w:t>// project/iOS/runner/</w:t>
+      </w:r>
+    </w:p>
+    <w:p>
+      <w:pPr>
+        <w:jc w:val="both"/>
+        <w:rPr>
+          <w:b/>
+          <w:bCs/>
+          <w:color w:val="D86DCB" w:themeColor="accent5" w:themeTint="99"/>
+          <w:sz w:val="32"/>
+          <w:szCs w:val="32"/>
+        </w:rPr>
+      </w:pPr>
+      <w:r>
+        <w:rPr>
+          <w:b/>
+          <w:bCs/>
+          <w:color w:val="D86DCB" w:themeColor="accent5" w:themeTint="99"/>
+          <w:sz w:val="32"/>
+          <w:szCs w:val="32"/>
+        </w:rPr>
+        <w:t>@main</w:t>
+      </w:r>
+    </w:p>
+    <w:p>
+      <w:pPr>
+        <w:jc w:val="both"/>
+        <w:rPr>
+          <w:b/>
+          <w:bCs/>
+          <w:color w:val="D86DCB" w:themeColor="accent5" w:themeTint="99"/>
+          <w:sz w:val="32"/>
+          <w:szCs w:val="32"/>
+        </w:rPr>
+      </w:pPr>
+      <w:r>
+        <w:rPr>
+          <w:b/>
+          <w:bCs/>
+          <w:color w:val="D86DCB" w:themeColor="accent5" w:themeTint="99"/>
+          <w:sz w:val="32"/>
+          <w:szCs w:val="32"/>
+        </w:rPr>
+        <w:t xml:space="preserve">@objc class </w:t>
+      </w:r>
+      <w:proofErr w:type="spellStart"/>
+      <w:r>
+        <w:rPr>
+          <w:b/>
+          <w:bCs/>
+          <w:color w:val="D86DCB" w:themeColor="accent5" w:themeTint="99"/>
+          <w:sz w:val="32"/>
+          <w:szCs w:val="32"/>
+        </w:rPr>
+        <w:t>AppDelegate</w:t>
+      </w:r>
+      <w:proofErr w:type="spellEnd"/>
+      <w:r>
+        <w:rPr>
+          <w:b/>
+          <w:bCs/>
+          <w:color w:val="D86DCB" w:themeColor="accent5" w:themeTint="99"/>
+          <w:sz w:val="32"/>
+          <w:szCs w:val="32"/>
+        </w:rPr>
+        <w:t xml:space="preserve">: </w:t>
+      </w:r>
+      <w:proofErr w:type="spellStart"/>
+      <w:r>
+        <w:rPr>
+          <w:b/>
+          <w:bCs/>
+          <w:color w:val="D86DCB" w:themeColor="accent5" w:themeTint="99"/>
+          <w:sz w:val="32"/>
+          <w:szCs w:val="32"/>
+        </w:rPr>
+        <w:t>FlutterAppDelegate</w:t>
+      </w:r>
+      <w:proofErr w:type="spellEnd"/>
+      <w:r>
+        <w:rPr>
+          <w:b/>
+          <w:bCs/>
+          <w:color w:val="D86DCB" w:themeColor="accent5" w:themeTint="99"/>
+          <w:sz w:val="32"/>
+          <w:szCs w:val="32"/>
+        </w:rPr>
+        <w:t xml:space="preserve"> {</w:t>
+      </w:r>
+    </w:p>
+    <w:p>
+      <w:pPr>
+        <w:jc w:val="both"/>
+        <w:rPr>
+          <w:b/>
+          <w:bCs/>
+          <w:color w:val="D86DCB" w:themeColor="accent5" w:themeTint="99"/>
+          <w:sz w:val="32"/>
+          <w:szCs w:val="32"/>
+        </w:rPr>
+      </w:pPr>
+      <w:r>
+        <w:rPr>
+          <w:b/>
+          <w:bCs/>
+          <w:color w:val="D86DCB" w:themeColor="accent5" w:themeTint="99"/>
+          <w:sz w:val="32"/>
+          <w:szCs w:val="32"/>
+        </w:rPr>
+        <w:t xml:space="preserve">override </w:t>
+      </w:r>
+      <w:proofErr w:type="spellStart"/>
+      <w:r>
+        <w:rPr>
+          <w:b/>
+          <w:bCs/>
+          <w:color w:val="D86DCB" w:themeColor="accent5" w:themeTint="99"/>
+          <w:sz w:val="32"/>
+          <w:szCs w:val="32"/>
+        </w:rPr>
+        <w:t>func</w:t>
+      </w:r>
+      <w:proofErr w:type="spellEnd"/>
+      <w:r>
+        <w:rPr>
+          <w:b/>
+          <w:bCs/>
+          <w:color w:val="D86DCB" w:themeColor="accent5" w:themeTint="99"/>
+          <w:sz w:val="32"/>
+          <w:szCs w:val="32"/>
+        </w:rPr>
+        <w:t xml:space="preserve"> </w:t>
+      </w:r>
+      <w:proofErr w:type="gramStart"/>
+      <w:r>
+        <w:rPr>
+          <w:b/>
+          <w:bCs/>
+          <w:color w:val="D86DCB" w:themeColor="accent5" w:themeTint="99"/>
+          <w:sz w:val="32"/>
+          <w:szCs w:val="32"/>
+        </w:rPr>
+        <w:t>application(</w:t>
+      </w:r>
+      <w:proofErr w:type="gramEnd"/>
+    </w:p>
+    <w:p>
+      <w:pPr>
+        <w:jc w:val="both"/>
+        <w:rPr>
+          <w:b/>
+          <w:bCs/>
+          <w:color w:val="D86DCB" w:themeColor="accent5" w:themeTint="99"/>
+          <w:sz w:val="32"/>
+          <w:szCs w:val="32"/>
+        </w:rPr>
+      </w:pPr>
+      <w:r>
+        <w:rPr>
+          <w:b/>
+          <w:bCs/>
+          <w:color w:val="D86DCB" w:themeColor="accent5" w:themeTint="99"/>
+          <w:sz w:val="32"/>
+          <w:szCs w:val="32"/>
+        </w:rPr>
+        <w:t xml:space="preserve">    </w:t>
+      </w:r>
+      <w:r>
+        <w:rPr>
+          <w:b/>
+          <w:bCs/>
+          <w:color w:val="D86DCB" w:themeColor="accent5" w:themeTint="99"/>
+          <w:sz w:val="32"/>
+          <w:szCs w:val="32"/>
+        </w:rPr>
+        <w:t xml:space="preserve">_ application: </w:t>
+      </w:r>
+      <w:proofErr w:type="spellStart"/>
+      <w:r>
+        <w:rPr>
+          <w:b/>
+          <w:bCs/>
+          <w:color w:val="D86DCB" w:themeColor="accent5" w:themeTint="99"/>
+          <w:sz w:val="32"/>
+          <w:szCs w:val="32"/>
+        </w:rPr>
+        <w:t>UIApplication</w:t>
+      </w:r>
+      <w:proofErr w:type="spellEnd"/>
+      <w:r>
+        <w:rPr>
+          <w:b/>
+          <w:bCs/>
+          <w:color w:val="D86DCB" w:themeColor="accent5" w:themeTint="99"/>
+          <w:sz w:val="32"/>
+          <w:szCs w:val="32"/>
+        </w:rPr>
+        <w:t>,</w:t>
+      </w:r>
+    </w:p>
+    <w:p>
+      <w:pPr>
+        <w:jc w:val="both"/>
+        <w:rPr>
+          <w:b/>
+          <w:bCs/>
+          <w:color w:val="D86DCB" w:themeColor="accent5" w:themeTint="99"/>
+          <w:sz w:val="32"/>
+          <w:szCs w:val="32"/>
+        </w:rPr>
+      </w:pPr>
+      <w:r>
+        <w:rPr>
+          <w:b/>
+          <w:bCs/>
+          <w:color w:val="D86DCB" w:themeColor="accent5" w:themeTint="99"/>
+          <w:sz w:val="32"/>
+          <w:szCs w:val="32"/>
+        </w:rPr>
+        <w:t xml:space="preserve">    </w:t>
+      </w:r>
+      <w:proofErr w:type="spellStart"/>
+      <w:r>
+        <w:rPr>
+          <w:b/>
+          <w:bCs/>
+          <w:color w:val="D86DCB" w:themeColor="accent5" w:themeTint="99"/>
+          <w:sz w:val="32"/>
+          <w:szCs w:val="32"/>
+        </w:rPr>
+        <w:t>didFinishLaunchingWithOptions</w:t>
+      </w:r>
+      <w:proofErr w:type="spellEnd"/>
+      <w:r>
+        <w:rPr>
+          <w:b/>
+          <w:bCs/>
+          <w:color w:val="D86DCB" w:themeColor="accent5" w:themeTint="99"/>
+          <w:sz w:val="32"/>
+          <w:szCs w:val="32"/>
+        </w:rPr>
+        <w:t xml:space="preserve">    </w:t>
+      </w:r>
+      <w:proofErr w:type="spellStart"/>
+      <w:r>
+        <w:rPr>
+          <w:b/>
+          <w:bCs/>
+          <w:color w:val="D86DCB" w:themeColor="accent5" w:themeTint="99"/>
+          <w:sz w:val="32"/>
+          <w:szCs w:val="32"/>
+        </w:rPr>
+        <w:t>launchOptions</w:t>
+      </w:r>
+      <w:proofErr w:type="spellEnd"/>
+      <w:r>
+        <w:rPr>
+          <w:b/>
+          <w:bCs/>
+          <w:color w:val="D86DCB" w:themeColor="accent5" w:themeTint="99"/>
+          <w:sz w:val="32"/>
+          <w:szCs w:val="32"/>
+        </w:rPr>
+        <w:t>:</w:t>
+      </w:r>
+    </w:p>
+    <w:p>
+      <w:pPr>
+        <w:jc w:val="both"/>
+        <w:rPr>
+          <w:b/>
+          <w:bCs/>
+          <w:color w:val="D86DCB" w:themeColor="accent5" w:themeTint="99"/>
+          <w:sz w:val="32"/>
+          <w:szCs w:val="32"/>
+        </w:rPr>
+      </w:pPr>
+      <w:r>
+        <w:rPr>
+          <w:b/>
+          <w:bCs/>
+          <w:color w:val="D86DCB" w:themeColor="accent5" w:themeTint="99"/>
+          <w:sz w:val="32"/>
+          <w:szCs w:val="32"/>
+        </w:rPr>
+        <w:lastRenderedPageBreak/>
+        <w:t xml:space="preserve">    </w:t>
+      </w:r>
+      <w:r>
+        <w:rPr>
+          <w:b/>
+          <w:bCs/>
+          <w:color w:val="D86DCB" w:themeColor="accent5" w:themeTint="99"/>
+          <w:sz w:val="32"/>
+          <w:szCs w:val="32"/>
+        </w:rPr>
+        <w:t xml:space="preserve">   [</w:t>
+      </w:r>
+      <w:proofErr w:type="spellStart"/>
+      <w:r>
+        <w:rPr>
+          <w:b/>
+          <w:bCs/>
+          <w:color w:val="D86DCB" w:themeColor="accent5" w:themeTint="99"/>
+          <w:sz w:val="32"/>
+          <w:szCs w:val="32"/>
+        </w:rPr>
+        <w:t>UIApplication.launchOptionsKey</w:t>
+      </w:r>
+      <w:proofErr w:type="spellEnd"/>
+      <w:r>
+        <w:rPr>
+          <w:b/>
+          <w:bCs/>
+          <w:color w:val="D86DCB" w:themeColor="accent5" w:themeTint="99"/>
+          <w:sz w:val="32"/>
+          <w:szCs w:val="32"/>
+        </w:rPr>
+        <w:t>: Any]?</w:t>
+      </w:r>
+    </w:p>
+    <w:p>
+      <w:pPr>
+        <w:jc w:val="both"/>
+        <w:rPr>
+          <w:b/>
+          <w:bCs/>
+          <w:color w:val="D86DCB" w:themeColor="accent5" w:themeTint="99"/>
+          <w:sz w:val="32"/>
+          <w:szCs w:val="32"/>
+        </w:rPr>
+      </w:pPr>
+      <w:proofErr w:type="gramStart"/>
+      <w:r>
+        <w:rPr>
+          <w:b/>
+          <w:bCs/>
+          <w:color w:val="D86DCB" w:themeColor="accent5" w:themeTint="99"/>
+          <w:sz w:val="32"/>
+          <w:szCs w:val="32"/>
+        </w:rPr>
+        <w:t>)  -</w:t>
+      </w:r>
+      <w:proofErr w:type="gramEnd"/>
+      <w:r>
+        <w:rPr>
+          <w:b/>
+          <w:bCs/>
+          <w:color w:val="D86DCB" w:themeColor="accent5" w:themeTint="99"/>
+          <w:sz w:val="32"/>
+          <w:szCs w:val="32"/>
+        </w:rPr>
+        <w:t>&gt;  Bool {</w:t>
+      </w:r>
+    </w:p>
+    <w:p>
+      <w:pPr>
+        <w:jc w:val="both"/>
+        <w:rPr>
+          <w:b/>
+          <w:bCs/>
+          <w:color w:val="D86DCB" w:themeColor="accent5" w:themeTint="99"/>
+          <w:sz w:val="32"/>
+          <w:szCs w:val="32"/>
+        </w:rPr>
+      </w:pPr>
+      <w:r>
+        <w:rPr>
+          <w:b/>
+          <w:bCs/>
+          <w:color w:val="D86DCB" w:themeColor="accent5" w:themeTint="99"/>
+          <w:sz w:val="32"/>
+          <w:szCs w:val="32"/>
+        </w:rPr>
+        <w:t xml:space="preserve">        </w:t>
+      </w:r>
+      <w:proofErr w:type="spellStart"/>
+      <w:r>
+        <w:rPr>
+          <w:b/>
+          <w:bCs/>
+          <w:color w:val="D86DCB" w:themeColor="accent5" w:themeTint="99"/>
+          <w:sz w:val="32"/>
+          <w:szCs w:val="32"/>
+        </w:rPr>
+        <w:t>GeneratedPluginRegistrant.register</w:t>
+      </w:r>
+      <w:proofErr w:type="spellEnd"/>
+      <w:r>
+        <w:rPr>
+          <w:b/>
+          <w:bCs/>
+          <w:color w:val="D86DCB" w:themeColor="accent5" w:themeTint="99"/>
+          <w:sz w:val="32"/>
+          <w:szCs w:val="32"/>
+        </w:rPr>
+        <w:t>(with: self)</w:t>
+      </w:r>
+    </w:p>
+    <w:p>
+      <w:pPr>
+        <w:jc w:val="both"/>
+        <w:rPr>
+          <w:b/>
+          <w:bCs/>
+          <w:color w:val="D86DCB" w:themeColor="accent5" w:themeTint="99"/>
+          <w:sz w:val="32"/>
+          <w:szCs w:val="32"/>
+        </w:rPr>
+      </w:pPr>
+      <w:r>
+        <w:rPr>
+          <w:b/>
+          <w:bCs/>
+          <w:color w:val="D86DCB" w:themeColor="accent5" w:themeTint="99"/>
+          <w:sz w:val="32"/>
+          <w:szCs w:val="32"/>
+        </w:rPr>
+        <w:t xml:space="preserve">        </w:t>
+      </w:r>
+    </w:p>
+    <w:p>
+      <w:pPr>
+        <w:jc w:val="both"/>
+        <w:rPr>
+          <w:b/>
+          <w:bCs/>
+          <w:color w:val="D86DCB" w:themeColor="accent5" w:themeTint="99"/>
+          <w:sz w:val="32"/>
+          <w:szCs w:val="32"/>
+        </w:rPr>
+      </w:pPr>
+      <w:r>
+        <w:rPr>
+          <w:b/>
+          <w:bCs/>
+          <w:color w:val="D86DCB" w:themeColor="accent5" w:themeTint="99"/>
+          <w:sz w:val="32"/>
+          <w:szCs w:val="32"/>
+        </w:rPr>
+        <w:t xml:space="preserve">        </w:t>
+      </w:r>
+      <w:r>
+        <w:rPr>
+          <w:b/>
+          <w:bCs/>
+          <w:color w:val="D86DCB" w:themeColor="accent5" w:themeTint="99"/>
+          <w:sz w:val="32"/>
+          <w:szCs w:val="32"/>
+        </w:rPr>
+        <w:t xml:space="preserve">// Create a </w:t>
+      </w:r>
+      <w:proofErr w:type="spellStart"/>
+      <w:r>
+        <w:rPr>
+          <w:b/>
+          <w:bCs/>
+          <w:color w:val="D86DCB" w:themeColor="accent5" w:themeTint="99"/>
+          <w:sz w:val="32"/>
+          <w:szCs w:val="32"/>
+        </w:rPr>
+        <w:t>MethodChannel</w:t>
+      </w:r>
+      <w:proofErr w:type="spellEnd"/>
+    </w:p>
+    <w:p>
+      <w:pPr>
+        <w:jc w:val="both"/>
+        <w:rPr>
+          <w:b/>
+          <w:bCs/>
+          <w:color w:val="D86DCB" w:themeColor="accent5" w:themeTint="99"/>
+          <w:sz w:val="32"/>
+          <w:szCs w:val="32"/>
+        </w:rPr>
+      </w:pPr>
+      <w:r>
+        <w:rPr>
+          <w:b/>
+          <w:bCs/>
+          <w:color w:val="D86DCB" w:themeColor="accent5" w:themeTint="99"/>
+          <w:sz w:val="32"/>
+          <w:szCs w:val="32"/>
+        </w:rPr>
+        <w:t xml:space="preserve">        </w:t>
+      </w:r>
+      <w:r>
+        <w:rPr>
+          <w:b/>
+          <w:bCs/>
+          <w:color w:val="D86DCB" w:themeColor="accent5" w:themeTint="99"/>
+          <w:sz w:val="32"/>
+          <w:szCs w:val="32"/>
+        </w:rPr>
+        <w:t xml:space="preserve">let channel = </w:t>
+      </w:r>
+      <w:proofErr w:type="spellStart"/>
+      <w:proofErr w:type="gramStart"/>
+      <w:r>
+        <w:rPr>
+          <w:b/>
+          <w:bCs/>
+          <w:color w:val="D86DCB" w:themeColor="accent5" w:themeTint="99"/>
+          <w:sz w:val="32"/>
+          <w:szCs w:val="32"/>
+        </w:rPr>
+        <w:t>FlutterMethodChannel</w:t>
+      </w:r>
+      <w:proofErr w:type="spellEnd"/>
+      <w:r>
+        <w:rPr>
+          <w:b/>
+          <w:bCs/>
+          <w:color w:val="D86DCB" w:themeColor="accent5" w:themeTint="99"/>
+          <w:sz w:val="32"/>
+          <w:szCs w:val="32"/>
+        </w:rPr>
+        <w:t>(</w:t>
+      </w:r>
+      <w:proofErr w:type="gramEnd"/>
+    </w:p>
+    <w:p>
+      <w:pPr>
+        <w:pStyle w:val="ListParagraph"/>
+        <w:numPr>
+          <w:ilvl w:val="0"/>
+          <w:numId w:val="46"/>
+        </w:numPr>
+        <w:jc w:val="both"/>
+        <w:rPr>
+          <w:b/>
+          <w:bCs/>
+          <w:color w:val="D86DCB" w:themeColor="accent5" w:themeTint="99"/>
+          <w:sz w:val="32"/>
+          <w:szCs w:val="32"/>
+        </w:rPr>
+      </w:pPr>
+      <w:r>
+        <w:rPr>
+          <w:b/>
+          <w:bCs/>
+          <w:color w:val="D86DCB" w:themeColor="accent5" w:themeTint="99"/>
+          <w:sz w:val="32"/>
+          <w:szCs w:val="32"/>
+        </w:rPr>
+        <w:t>name: “</w:t>
+      </w:r>
+      <w:proofErr w:type="spellStart"/>
+      <w:r>
+        <w:rPr>
+          <w:b/>
+          <w:bCs/>
+          <w:color w:val="D86DCB" w:themeColor="accent5" w:themeTint="99"/>
+          <w:sz w:val="32"/>
+          <w:szCs w:val="32"/>
+        </w:rPr>
+        <w:t>com.example</w:t>
+      </w:r>
+      <w:proofErr w:type="spellEnd"/>
+      <w:r>
+        <w:rPr>
+          <w:b/>
+          <w:bCs/>
+          <w:color w:val="D86DCB" w:themeColor="accent5" w:themeTint="99"/>
+          <w:sz w:val="32"/>
+          <w:szCs w:val="32"/>
+        </w:rPr>
+        <w:t>/app”</w:t>
+      </w:r>
+    </w:p>
+    <w:p>
+      <w:pPr>
+        <w:jc w:val="both"/>
+        <w:rPr>
+          <w:b/>
+          <w:bCs/>
+          <w:color w:val="D86DCB" w:themeColor="accent5" w:themeTint="99"/>
+          <w:sz w:val="32"/>
+          <w:szCs w:val="32"/>
+        </w:rPr>
+      </w:pPr>
+      <w:r>
+        <w:rPr>
+          <w:b/>
+          <w:bCs/>
+          <w:color w:val="D86DCB" w:themeColor="accent5" w:themeTint="99"/>
+          <w:sz w:val="32"/>
+          <w:szCs w:val="32"/>
+        </w:rPr>
+        <w:t xml:space="preserve">            </w:t>
+      </w:r>
+      <w:r>
+        <w:rPr>
+          <w:b/>
+          <w:bCs/>
+          <w:color w:val="D86DCB" w:themeColor="accent5" w:themeTint="99"/>
+          <w:sz w:val="32"/>
+          <w:szCs w:val="32"/>
+        </w:rPr>
+        <w:t>-</w:t>
+      </w:r>
+      <w:r>
+        <w:rPr>
+          <w:b/>
+          <w:bCs/>
+          <w:color w:val="D86DCB" w:themeColor="accent5" w:themeTint="99"/>
+          <w:sz w:val="32"/>
+          <w:szCs w:val="32"/>
+        </w:rPr>
+        <w:t xml:space="preserve">    </w:t>
+      </w:r>
+      <w:proofErr w:type="spellStart"/>
+      <w:r>
+        <w:rPr>
+          <w:b/>
+          <w:bCs/>
+          <w:color w:val="D86DCB" w:themeColor="accent5" w:themeTint="99"/>
+          <w:sz w:val="32"/>
+          <w:szCs w:val="32"/>
+        </w:rPr>
+        <w:t>binaryMessenger</w:t>
+      </w:r>
+      <w:proofErr w:type="spellEnd"/>
+      <w:r>
+        <w:rPr>
+          <w:b/>
+          <w:bCs/>
+          <w:color w:val="D86DCB" w:themeColor="accent5" w:themeTint="99"/>
+          <w:sz w:val="32"/>
+          <w:szCs w:val="32"/>
+        </w:rPr>
+        <w:t xml:space="preserve">: </w:t>
+      </w:r>
+      <w:proofErr w:type="spellStart"/>
+      <w:proofErr w:type="gramStart"/>
+      <w:r>
+        <w:rPr>
+          <w:b/>
+          <w:bCs/>
+          <w:color w:val="D86DCB" w:themeColor="accent5" w:themeTint="99"/>
+          <w:sz w:val="32"/>
+          <w:szCs w:val="32"/>
+        </w:rPr>
+        <w:t>self.window</w:t>
+      </w:r>
+      <w:proofErr w:type="spellEnd"/>
+      <w:proofErr w:type="gramEnd"/>
+      <w:r>
+        <w:rPr>
+          <w:b/>
+          <w:bCs/>
+          <w:color w:val="D86DCB" w:themeColor="accent5" w:themeTint="99"/>
+          <w:sz w:val="32"/>
+          <w:szCs w:val="32"/>
+        </w:rPr>
+        <w:t>!</w:t>
+      </w:r>
+    </w:p>
+    <w:p>
+      <w:pPr>
+        <w:jc w:val="both"/>
+        <w:rPr>
+          <w:b/>
+          <w:bCs/>
+          <w:color w:val="D86DCB" w:themeColor="accent5" w:themeTint="99"/>
+          <w:sz w:val="32"/>
+          <w:szCs w:val="32"/>
+        </w:rPr>
+      </w:pPr>
+      <w:r>
+        <w:rPr>
+          <w:b/>
+          <w:bCs/>
+          <w:color w:val="D86DCB" w:themeColor="accent5" w:themeTint="99"/>
+          <w:sz w:val="32"/>
+          <w:szCs w:val="32"/>
+        </w:rPr>
+        <w:t xml:space="preserve">                    </w:t>
+      </w:r>
+      <w:proofErr w:type="gramStart"/>
+      <w:r>
+        <w:rPr>
+          <w:b/>
+          <w:bCs/>
+          <w:color w:val="D86DCB" w:themeColor="accent5" w:themeTint="99"/>
+          <w:sz w:val="32"/>
+          <w:szCs w:val="32"/>
+        </w:rPr>
+        <w:t>.</w:t>
+      </w:r>
+      <w:proofErr w:type="spellStart"/>
+      <w:r>
+        <w:rPr>
+          <w:b/>
+          <w:bCs/>
+          <w:color w:val="D86DCB" w:themeColor="accent5" w:themeTint="99"/>
+          <w:sz w:val="32"/>
+          <w:szCs w:val="32"/>
+        </w:rPr>
+        <w:t>rootViewController</w:t>
+      </w:r>
+      <w:proofErr w:type="spellEnd"/>
+      <w:proofErr w:type="gramEnd"/>
+      <w:r>
+        <w:rPr>
+          <w:b/>
+          <w:bCs/>
+          <w:color w:val="D86DCB" w:themeColor="accent5" w:themeTint="99"/>
+          <w:sz w:val="32"/>
+          <w:szCs w:val="32"/>
+        </w:rPr>
+        <w:t xml:space="preserve"> as !</w:t>
+      </w:r>
+      <w:proofErr w:type="spellStart"/>
+      <w:r>
+        <w:rPr>
+          <w:b/>
+          <w:bCs/>
+          <w:color w:val="D86DCB" w:themeColor="accent5" w:themeTint="99"/>
+          <w:sz w:val="32"/>
+          <w:szCs w:val="32"/>
+        </w:rPr>
+        <w:t>FlutterViewController</w:t>
+      </w:r>
+      <w:proofErr w:type="spellEnd"/>
+    </w:p>
+    <w:p>
+      <w:pPr>
+        <w:jc w:val="both"/>
+        <w:rPr>
+          <w:b/>
+          <w:bCs/>
+          <w:color w:val="D86DCB" w:themeColor="accent5" w:themeTint="99"/>
+          <w:sz w:val="32"/>
+          <w:szCs w:val="32"/>
+        </w:rPr>
+      </w:pPr>
+      <w:r>
+        <w:rPr>
+          <w:b/>
+          <w:bCs/>
+          <w:color w:val="D86DCB" w:themeColor="accent5" w:themeTint="99"/>
+          <w:sz w:val="32"/>
+          <w:szCs w:val="32"/>
+        </w:rPr>
+        <w:t xml:space="preserve">                    </w:t>
+      </w:r>
+      <w:proofErr w:type="gramStart"/>
+      <w:r>
+        <w:rPr>
+          <w:b/>
+          <w:bCs/>
+          <w:color w:val="D86DCB" w:themeColor="accent5" w:themeTint="99"/>
+          <w:sz w:val="32"/>
+          <w:szCs w:val="32"/>
+        </w:rPr>
+        <w:t>.</w:t>
+      </w:r>
+      <w:proofErr w:type="spellStart"/>
+      <w:r>
+        <w:rPr>
+          <w:b/>
+          <w:bCs/>
+          <w:color w:val="D86DCB" w:themeColor="accent5" w:themeTint="99"/>
+          <w:sz w:val="32"/>
+          <w:szCs w:val="32"/>
+        </w:rPr>
+        <w:t>binaryMessenger</w:t>
+      </w:r>
+      <w:proofErr w:type="spellEnd"/>
+      <w:proofErr w:type="gramEnd"/>
+    </w:p>
+    <w:p>
+      <w:pPr>
+        <w:jc w:val="both"/>
+        <w:rPr>
+          <w:b/>
+          <w:bCs/>
+          <w:color w:val="D86DCB" w:themeColor="accent5" w:themeTint="99"/>
+          <w:sz w:val="32"/>
+          <w:szCs w:val="32"/>
+        </w:rPr>
+      </w:pPr>
+      <w:r>
+        <w:rPr>
+          <w:b/>
+          <w:bCs/>
+          <w:color w:val="D86DCB" w:themeColor="accent5" w:themeTint="99"/>
+          <w:sz w:val="32"/>
+          <w:szCs w:val="32"/>
+        </w:rPr>
+        <w:t xml:space="preserve">        </w:t>
+      </w:r>
+      <w:r>
+        <w:rPr>
+          <w:b/>
+          <w:bCs/>
+          <w:color w:val="D86DCB" w:themeColor="accent5" w:themeTint="99"/>
+          <w:sz w:val="32"/>
+          <w:szCs w:val="32"/>
+        </w:rPr>
+        <w:t>)</w:t>
+      </w:r>
+    </w:p>
+    <w:p>
+      <w:pPr>
+        <w:jc w:val="both"/>
+        <w:rPr>
+          <w:b/>
+          <w:bCs/>
+          <w:color w:val="D86DCB" w:themeColor="accent5" w:themeTint="99"/>
+          <w:sz w:val="32"/>
+          <w:szCs w:val="32"/>
+        </w:rPr>
+      </w:pPr>
+      <w:r>
+        <w:rPr>
+          <w:b/>
+          <w:bCs/>
+          <w:color w:val="D86DCB" w:themeColor="accent5" w:themeTint="99"/>
+          <w:sz w:val="32"/>
+          <w:szCs w:val="32"/>
+        </w:rPr>
+        <w:t xml:space="preserve">        </w:t>
+      </w:r>
+      <w:r>
+        <w:rPr>
+          <w:b/>
+          <w:bCs/>
+          <w:color w:val="D86DCB" w:themeColor="accent5" w:themeTint="99"/>
+          <w:sz w:val="32"/>
+          <w:szCs w:val="32"/>
+        </w:rPr>
+        <w:t xml:space="preserve">return </w:t>
+      </w:r>
+      <w:proofErr w:type="spellStart"/>
+      <w:r>
+        <w:rPr>
+          <w:b/>
+          <w:bCs/>
+          <w:color w:val="D86DCB" w:themeColor="accent5" w:themeTint="99"/>
+          <w:sz w:val="32"/>
+          <w:szCs w:val="32"/>
+        </w:rPr>
+        <w:t>super.</w:t>
+      </w:r>
+      <w:proofErr w:type="gramStart"/>
+      <w:r>
+        <w:rPr>
+          <w:b/>
+          <w:bCs/>
+          <w:color w:val="D86DCB" w:themeColor="accent5" w:themeTint="99"/>
+          <w:sz w:val="32"/>
+          <w:szCs w:val="32"/>
+        </w:rPr>
+        <w:t>application</w:t>
+      </w:r>
+      <w:proofErr w:type="spellEnd"/>
+      <w:r>
+        <w:rPr>
+          <w:b/>
+          <w:bCs/>
+          <w:color w:val="D86DCB" w:themeColor="accent5" w:themeTint="99"/>
+          <w:sz w:val="32"/>
+          <w:szCs w:val="32"/>
+        </w:rPr>
+        <w:t>(</w:t>
+      </w:r>
+      <w:proofErr w:type="gramEnd"/>
+      <w:r>
+        <w:rPr>
+          <w:b/>
+          <w:bCs/>
+          <w:color w:val="D86DCB" w:themeColor="accent5" w:themeTint="99"/>
+          <w:sz w:val="32"/>
+          <w:szCs w:val="32"/>
+        </w:rPr>
+        <w:t>application,</w:t>
+      </w:r>
+    </w:p>
+    <w:p>
+      <w:pPr>
+        <w:jc w:val="both"/>
+        <w:rPr>
+          <w:b/>
+          <w:bCs/>
+          <w:color w:val="D86DCB" w:themeColor="accent5" w:themeTint="99"/>
+          <w:sz w:val="32"/>
+          <w:szCs w:val="32"/>
+        </w:rPr>
+      </w:pPr>
+      <w:r>
+        <w:rPr>
+          <w:b/>
+          <w:bCs/>
+          <w:color w:val="D86DCB" w:themeColor="accent5" w:themeTint="99"/>
+          <w:sz w:val="32"/>
+          <w:szCs w:val="32"/>
+        </w:rPr>
+        <w:t xml:space="preserve">            </w:t>
+      </w:r>
+      <w:proofErr w:type="spellStart"/>
+      <w:r>
+        <w:rPr>
+          <w:b/>
+          <w:bCs/>
+          <w:color w:val="D86DCB" w:themeColor="accent5" w:themeTint="99"/>
+          <w:sz w:val="32"/>
+          <w:szCs w:val="32"/>
+        </w:rPr>
+        <w:t>didFinishLaunchingWithOptions</w:t>
+      </w:r>
+      <w:proofErr w:type="spellEnd"/>
+      <w:r>
+        <w:rPr>
+          <w:b/>
+          <w:bCs/>
+          <w:color w:val="D86DCB" w:themeColor="accent5" w:themeTint="99"/>
+          <w:sz w:val="32"/>
+          <w:szCs w:val="32"/>
+        </w:rPr>
+        <w:t xml:space="preserve">: </w:t>
+      </w:r>
+      <w:proofErr w:type="spellStart"/>
+      <w:r>
+        <w:rPr>
+          <w:b/>
+          <w:bCs/>
+          <w:color w:val="D86DCB" w:themeColor="accent5" w:themeTint="99"/>
+          <w:sz w:val="32"/>
+          <w:szCs w:val="32"/>
+        </w:rPr>
+        <w:t>launchOptions</w:t>
+      </w:r>
+      <w:proofErr w:type="spellEnd"/>
+      <w:r>
+        <w:rPr>
+          <w:b/>
+          <w:bCs/>
+          <w:color w:val="D86DCB" w:themeColor="accent5" w:themeTint="99"/>
+          <w:sz w:val="32"/>
+          <w:szCs w:val="32"/>
+        </w:rPr>
+        <w:t>)</w:t>
+      </w:r>
+    </w:p>
+    <w:p>
+      <w:pPr>
+        <w:jc w:val="both"/>
+        <w:rPr>
+          <w:b/>
+          <w:bCs/>
+          <w:color w:val="D86DCB" w:themeColor="accent5" w:themeTint="99"/>
+          <w:sz w:val="32"/>
+          <w:szCs w:val="32"/>
+        </w:rPr>
+      </w:pPr>
+      <w:r>
+        <w:rPr>
+          <w:b/>
+          <w:bCs/>
+          <w:color w:val="D86DCB" w:themeColor="accent5" w:themeTint="99"/>
+          <w:sz w:val="32"/>
+          <w:szCs w:val="32"/>
+        </w:rPr>
+        <w:t xml:space="preserve">    </w:t>
+      </w:r>
+      <w:r>
+        <w:rPr>
+          <w:b/>
+          <w:bCs/>
+          <w:color w:val="D86DCB" w:themeColor="accent5" w:themeTint="99"/>
+          <w:sz w:val="32"/>
+          <w:szCs w:val="32"/>
+        </w:rPr>
+        <w:t>}</w:t>
+      </w:r>
+    </w:p>
+    <w:p>
+      <w:pPr>
+        <w:jc w:val="both"/>
+        <w:rPr>
+          <w:sz w:val="32"/>
+          <w:szCs w:val="32"/>
+        </w:rPr>
+      </w:pPr>
+      <w:r>
+        <w:rPr>
+          <w:b/>
+          <w:bCs/>
+          <w:color w:val="D86DCB" w:themeColor="accent5" w:themeTint="99"/>
+          <w:sz w:val="32"/>
+          <w:szCs w:val="32"/>
+        </w:rPr>
+        <w:t>}</w:t>
+      </w:r>
+    </w:p>
+    <w:p>
+      <w:pPr>
+        <w:jc w:val="both"/>
+        <w:rPr>
+          <w:sz w:val="32"/>
+          <w:szCs w:val="32"/>
+        </w:rPr>
+      </w:pPr>
+    </w:p>
+    <w:p>
+      <w:pPr>
+        <w:jc w:val="both"/>
+        <w:rPr>
+          <w:sz w:val="32"/>
+          <w:szCs w:val="32"/>
+        </w:rPr>
+      </w:pPr>
+    </w:p>
+    <w:p>
+      <w:pPr>
+        <w:jc w:val="center"/>
+        <w:rPr>
+          <w:sz w:val="32"/>
+          <w:szCs w:val="32"/>
+        </w:rPr>
+      </w:pPr>
+      <w:r>
+        <w:rPr>
+          <w:sz w:val="32"/>
+          <w:szCs w:val="32"/>
+        </w:rPr>
+        <w:t>Break</w:t>
+      </w:r>
+    </w:p>
+    <w:p>
+      <w:pPr>
+        <w:jc w:val="both"/>
+        <w:rPr>
+          <w:sz w:val="32"/>
+          <w:szCs w:val="32"/>
+        </w:rPr>
+      </w:pPr>
+    </w:p>
+    <w:p>
+      <w:pPr>
+        <w:jc w:val="both"/>
+        <w:rPr>
+          <w:b/>
+          <w:bCs/>
+          <w:sz w:val="32"/>
+          <w:szCs w:val="32"/>
+        </w:rPr>
+      </w:pPr>
       <w:r>
         <w:rPr>
           <w:b/>
@@ -11344,7 +13964,6 @@
           <w:sz w:val="32"/>
           <w:szCs w:val="32"/>
         </w:rPr>
-        <w:lastRenderedPageBreak/>
         <w:t>Debounce user input – prevent flooding API calls from search bars.</w:t>
       </w:r>
     </w:p>
@@ -11481,7 +14100,7 @@
           <w:sz w:val="32"/>
           <w:szCs w:val="32"/>
         </w:rPr>
-        <w:t>Advanced Tips</w:t>
+        <w:t>Offload heavy computations to Isolates.</w:t>
       </w:r>
     </w:p>
     <w:p>
@@ -11502,7 +14121,7 @@
           <w:sz w:val="32"/>
           <w:szCs w:val="32"/>
         </w:rPr>
-        <w:t>Offload heavy computations to Isolates.</w:t>
+        <w:t>Optimize database queries – lazy load, index, and limit data.</w:t>
       </w:r>
     </w:p>
     <w:p>
@@ -11518,12 +14137,35 @@
           <w:szCs w:val="32"/>
         </w:rPr>
       </w:pPr>
-      <w:r>
-        <w:rPr>
-          <w:sz w:val="32"/>
-          <w:szCs w:val="32"/>
-        </w:rPr>
-        <w:t>Optimize database queries – lazy load, index, and limit data.</w:t>
+      <w:proofErr w:type="gramStart"/>
+      <w:r>
+        <w:rPr>
+          <w:sz w:val="32"/>
+          <w:szCs w:val="32"/>
+        </w:rPr>
+        <w:t>Cache</w:t>
+      </w:r>
+      <w:r>
+        <w:rPr>
+          <w:sz w:val="32"/>
+          <w:szCs w:val="32"/>
+        </w:rPr>
+        <w:t xml:space="preserve">  (</w:t>
+      </w:r>
+      <w:proofErr w:type="gramEnd"/>
+      <w:r>
+        <w:rPr>
+          <w:sz w:val="32"/>
+          <w:szCs w:val="32"/>
+        </w:rPr>
+        <w:t>Repository Layer)</w:t>
+      </w:r>
+      <w:r>
+        <w:rPr>
+          <w:sz w:val="32"/>
+          <w:szCs w:val="32"/>
+        </w:rPr>
+        <w:t xml:space="preserve"> network responses to reduce repeated API calls.</w:t>
       </w:r>
     </w:p>
     <w:p>
@@ -11544,7 +14186,40 @@
           <w:sz w:val="32"/>
           <w:szCs w:val="32"/>
         </w:rPr>
-        <w:t>Cache network responses to reduce repeated API calls.</w:t>
+        <w:lastRenderedPageBreak/>
+        <w:t xml:space="preserve">Use </w:t>
+      </w:r>
+      <w:r>
+        <w:rPr>
+          <w:b/>
+          <w:bCs/>
+          <w:sz w:val="32"/>
+          <w:szCs w:val="32"/>
+        </w:rPr>
+        <w:t>const</w:t>
+      </w:r>
+      <w:r>
+        <w:rPr>
+          <w:sz w:val="32"/>
+          <w:szCs w:val="32"/>
+        </w:rPr>
+        <w:t xml:space="preserve"> &amp; </w:t>
+      </w:r>
+      <w:r>
+        <w:rPr>
+          <w:b/>
+          <w:bCs/>
+          <w:sz w:val="32"/>
+          <w:szCs w:val="32"/>
+        </w:rPr>
+        <w:t>final</w:t>
+      </w:r>
+      <w:r>
+        <w:rPr>
+          <w:sz w:val="32"/>
+          <w:szCs w:val="32"/>
+        </w:rPr>
+        <w:t xml:space="preserve"> wisely to prevent unnecessary rebuilds.</w:t>
       </w:r>
     </w:p>
     <w:p>
@@ -11565,7 +14240,25 @@
           <w:sz w:val="32"/>
           <w:szCs w:val="32"/>
         </w:rPr>
-        <w:t>Use const &amp; final wisely to prevent unnecessary rebuilds.</w:t>
+        <w:t xml:space="preserve">Minimize repaints with </w:t>
+      </w:r>
+      <w:proofErr w:type="spellStart"/>
+      <w:r>
+        <w:rPr>
+          <w:b/>
+          <w:bCs/>
+          <w:sz w:val="32"/>
+          <w:szCs w:val="32"/>
+        </w:rPr>
+        <w:t>RepaintBoundary</w:t>
+      </w:r>
+      <w:proofErr w:type="spellEnd"/>
+      <w:r>
+        <w:rPr>
+          <w:sz w:val="32"/>
+          <w:szCs w:val="32"/>
+        </w:rPr>
+        <w:t xml:space="preserve"> for animations.</w:t>
       </w:r>
     </w:p>
     <w:p>
@@ -11586,25 +14279,7 @@
           <w:sz w:val="32"/>
           <w:szCs w:val="32"/>
         </w:rPr>
-        <w:t xml:space="preserve">Minimize repaints with </w:t>
-      </w:r>
-      <w:proofErr w:type="spellStart"/>
-      <w:r>
-        <w:rPr>
-          <w:b/>
-          <w:bCs/>
-          <w:sz w:val="32"/>
-          <w:szCs w:val="32"/>
-        </w:rPr>
-        <w:t>RepaintBoundary</w:t>
-      </w:r>
-      <w:proofErr w:type="spellEnd"/>
-      <w:r>
-        <w:rPr>
-          <w:sz w:val="32"/>
-          <w:szCs w:val="32"/>
-        </w:rPr>
-        <w:t xml:space="preserve"> for animations.</w:t>
+        <w:t>Avoid blocking the main thread – async everything.</w:t>
       </w:r>
     </w:p>
     <w:p>
@@ -11625,27 +14300,6 @@
           <w:sz w:val="32"/>
           <w:szCs w:val="32"/>
         </w:rPr>
-        <w:t>Avoid blocking the main thread – async everything.</w:t>
-      </w:r>
-    </w:p>
-    <w:p>
-      <w:pPr>
-        <w:pStyle w:val="ListParagraph"/>
-        <w:numPr>
-          <w:ilvl w:val="0"/>
-          <w:numId w:val="1"/>
-        </w:numPr>
-        <w:jc w:val="both"/>
-        <w:rPr>
-          <w:sz w:val="32"/>
-          <w:szCs w:val="32"/>
-        </w:rPr>
-      </w:pPr>
-      <w:r>
-        <w:rPr>
-          <w:sz w:val="32"/>
-          <w:szCs w:val="32"/>
-        </w:rPr>
         <w:t xml:space="preserve">Optimize image &amp; media loading – placeholders, lazy loading, </w:t>
       </w:r>
       <w:proofErr w:type="spellStart"/>
@@ -11665,27 +14319,6 @@
           <w:szCs w:val="32"/>
         </w:rPr>
         <w:t>, streaming.</w:t>
-      </w:r>
-    </w:p>
-    <w:p>
-      <w:pPr>
-        <w:pStyle w:val="ListParagraph"/>
-        <w:numPr>
-          <w:ilvl w:val="0"/>
-          <w:numId w:val="1"/>
-        </w:numPr>
-        <w:jc w:val="both"/>
-        <w:rPr>
-          <w:sz w:val="32"/>
-          <w:szCs w:val="32"/>
-        </w:rPr>
-      </w:pPr>
-      <w:r>
-        <w:rPr>
-          <w:sz w:val="32"/>
-          <w:szCs w:val="32"/>
-        </w:rPr>
-        <w:t>Keep learning &amp; updating – Flutter evolves fast; stay on top of best practices.</w:t>
       </w:r>
     </w:p>
     <w:p>
@@ -13540,6 +16173,119 @@
     </w:lvl>
   </w:abstractNum>
   <w:abstractNum w:abstractNumId="15" w15:restartNumberingAfterBreak="0">
+    <w:nsid w:val="3261745E"/>
+    <w:multiLevelType w:val="hybridMultilevel"/>
+    <w:tmpl w:val="0F48A09A"/>
+    <w:lvl w:ilvl="0" w:tplc="04090001">
+      <w:start w:val="1"/>
+      <w:numFmt w:val="bullet"/>
+      <w:lvlText w:val=""/>
+      <w:lvlJc w:val="left"/>
+      <w:pPr>
+        <w:ind w:left="360" w:hanging="360"/>
+      </w:pPr>
+      <w:rPr>
+        <w:rFonts w:ascii="Symbol" w:hAnsi="Symbol" w:hint="default"/>
+      </w:rPr>
+    </w:lvl>
+    <w:lvl w:ilvl="1" w:tplc="04090003" w:tentative="1">
+      <w:start w:val="1"/>
+      <w:numFmt w:val="bullet"/>
+      <w:lvlText w:val="o"/>
+      <w:lvlJc w:val="left"/>
+      <w:pPr>
+        <w:ind w:left="1080" w:hanging="360"/>
+      </w:pPr>
+      <w:rPr>
+        <w:rFonts w:ascii="Courier New" w:hAnsi="Courier New" w:cs="Courier New" w:hint="default"/>
+      </w:rPr>
+    </w:lvl>
+    <w:lvl w:ilvl="2" w:tplc="04090005" w:tentative="1">
+      <w:start w:val="1"/>
+      <w:numFmt w:val="bullet"/>
+      <w:lvlText w:val=""/>
+      <w:lvlJc w:val="left"/>
+      <w:pPr>
+        <w:ind w:left="1800" w:hanging="360"/>
+      </w:pPr>
+      <w:rPr>
+        <w:rFonts w:ascii="Wingdings" w:hAnsi="Wingdings" w:hint="default"/>
+      </w:rPr>
+    </w:lvl>
+    <w:lvl w:ilvl="3" w:tplc="04090001" w:tentative="1">
+      <w:start w:val="1"/>
+      <w:numFmt w:val="bullet"/>
+      <w:lvlText w:val=""/>
+      <w:lvlJc w:val="left"/>
+      <w:pPr>
+        <w:ind w:left="2520" w:hanging="360"/>
+      </w:pPr>
+      <w:rPr>
+        <w:rFonts w:ascii="Symbol" w:hAnsi="Symbol" w:hint="default"/>
+      </w:rPr>
+    </w:lvl>
+    <w:lvl w:ilvl="4" w:tplc="04090003" w:tentative="1">
+      <w:start w:val="1"/>
+      <w:numFmt w:val="bullet"/>
+      <w:lvlText w:val="o"/>
+      <w:lvlJc w:val="left"/>
+      <w:pPr>
+        <w:ind w:left="3240" w:hanging="360"/>
+      </w:pPr>
+      <w:rPr>
+        <w:rFonts w:ascii="Courier New" w:hAnsi="Courier New" w:cs="Courier New" w:hint="default"/>
+      </w:rPr>
+    </w:lvl>
+    <w:lvl w:ilvl="5" w:tplc="04090005" w:tentative="1">
+      <w:start w:val="1"/>
+      <w:numFmt w:val="bullet"/>
+      <w:lvlText w:val=""/>
+      <w:lvlJc w:val="left"/>
+      <w:pPr>
+        <w:ind w:left="3960" w:hanging="360"/>
+      </w:pPr>
+      <w:rPr>
+        <w:rFonts w:ascii="Wingdings" w:hAnsi="Wingdings" w:hint="default"/>
+      </w:rPr>
+    </w:lvl>
+    <w:lvl w:ilvl="6" w:tplc="04090001" w:tentative="1">
+      <w:start w:val="1"/>
+      <w:numFmt w:val="bullet"/>
+      <w:lvlText w:val=""/>
+      <w:lvlJc w:val="left"/>
+      <w:pPr>
+        <w:ind w:left="4680" w:hanging="360"/>
+      </w:pPr>
+      <w:rPr>
+        <w:rFonts w:ascii="Symbol" w:hAnsi="Symbol" w:hint="default"/>
+      </w:rPr>
+    </w:lvl>
+    <w:lvl w:ilvl="7" w:tplc="04090003" w:tentative="1">
+      <w:start w:val="1"/>
+      <w:numFmt w:val="bullet"/>
+      <w:lvlText w:val="o"/>
+      <w:lvlJc w:val="left"/>
+      <w:pPr>
+        <w:ind w:left="5400" w:hanging="360"/>
+      </w:pPr>
+      <w:rPr>
+        <w:rFonts w:ascii="Courier New" w:hAnsi="Courier New" w:cs="Courier New" w:hint="default"/>
+      </w:rPr>
+    </w:lvl>
+    <w:lvl w:ilvl="8" w:tplc="04090005" w:tentative="1">
+      <w:start w:val="1"/>
+      <w:numFmt w:val="bullet"/>
+      <w:lvlText w:val=""/>
+      <w:lvlJc w:val="left"/>
+      <w:pPr>
+        <w:ind w:left="6120" w:hanging="360"/>
+      </w:pPr>
+      <w:rPr>
+        <w:rFonts w:ascii="Wingdings" w:hAnsi="Wingdings" w:hint="default"/>
+      </w:rPr>
+    </w:lvl>
+  </w:abstractNum>
+  <w:abstractNum w:abstractNumId="16" w15:restartNumberingAfterBreak="0">
     <w:nsid w:val="38125930"/>
     <w:multiLevelType w:val="hybridMultilevel"/>
     <w:tmpl w:val="81E83932"/>
@@ -13652,7 +16398,7 @@
       </w:rPr>
     </w:lvl>
   </w:abstractNum>
-  <w:abstractNum w:abstractNumId="16" w15:restartNumberingAfterBreak="0">
+  <w:abstractNum w:abstractNumId="17" w15:restartNumberingAfterBreak="0">
     <w:nsid w:val="3D0C31F4"/>
     <w:multiLevelType w:val="hybridMultilevel"/>
     <w:tmpl w:val="11BA73A6"/>
@@ -13765,7 +16511,7 @@
       </w:rPr>
     </w:lvl>
   </w:abstractNum>
-  <w:abstractNum w:abstractNumId="17" w15:restartNumberingAfterBreak="0">
+  <w:abstractNum w:abstractNumId="18" w15:restartNumberingAfterBreak="0">
     <w:nsid w:val="3E2B4A32"/>
     <w:multiLevelType w:val="hybridMultilevel"/>
     <w:tmpl w:val="68EA64A6"/>
@@ -13878,7 +16624,7 @@
       </w:rPr>
     </w:lvl>
   </w:abstractNum>
-  <w:abstractNum w:abstractNumId="18" w15:restartNumberingAfterBreak="0">
+  <w:abstractNum w:abstractNumId="19" w15:restartNumberingAfterBreak="0">
     <w:nsid w:val="418E3533"/>
     <w:multiLevelType w:val="hybridMultilevel"/>
     <w:tmpl w:val="5C86DA0A"/>
@@ -13991,7 +16737,7 @@
       </w:rPr>
     </w:lvl>
   </w:abstractNum>
-  <w:abstractNum w:abstractNumId="19" w15:restartNumberingAfterBreak="0">
+  <w:abstractNum w:abstractNumId="20" w15:restartNumberingAfterBreak="0">
     <w:nsid w:val="41CD1F37"/>
     <w:multiLevelType w:val="hybridMultilevel"/>
     <w:tmpl w:val="70143470"/>
@@ -14104,7 +16850,7 @@
       </w:rPr>
     </w:lvl>
   </w:abstractNum>
-  <w:abstractNum w:abstractNumId="20" w15:restartNumberingAfterBreak="0">
+  <w:abstractNum w:abstractNumId="21" w15:restartNumberingAfterBreak="0">
     <w:nsid w:val="42A8721F"/>
     <w:multiLevelType w:val="hybridMultilevel"/>
     <w:tmpl w:val="E2F68D04"/>
@@ -14217,7 +16963,7 @@
       </w:rPr>
     </w:lvl>
   </w:abstractNum>
-  <w:abstractNum w:abstractNumId="21" w15:restartNumberingAfterBreak="0">
+  <w:abstractNum w:abstractNumId="22" w15:restartNumberingAfterBreak="0">
     <w:nsid w:val="431836C6"/>
     <w:multiLevelType w:val="hybridMultilevel"/>
     <w:tmpl w:val="28CA1800"/>
@@ -14330,7 +17076,7 @@
       </w:rPr>
     </w:lvl>
   </w:abstractNum>
-  <w:abstractNum w:abstractNumId="22" w15:restartNumberingAfterBreak="0">
+  <w:abstractNum w:abstractNumId="23" w15:restartNumberingAfterBreak="0">
     <w:nsid w:val="436B2F14"/>
     <w:multiLevelType w:val="hybridMultilevel"/>
     <w:tmpl w:val="A08ED180"/>
@@ -14443,7 +17189,120 @@
       </w:rPr>
     </w:lvl>
   </w:abstractNum>
-  <w:abstractNum w:abstractNumId="23" w15:restartNumberingAfterBreak="0">
+  <w:abstractNum w:abstractNumId="24" w15:restartNumberingAfterBreak="0">
+    <w:nsid w:val="49882197"/>
+    <w:multiLevelType w:val="hybridMultilevel"/>
+    <w:tmpl w:val="C2282316"/>
+    <w:lvl w:ilvl="0" w:tplc="04090001">
+      <w:start w:val="1"/>
+      <w:numFmt w:val="bullet"/>
+      <w:lvlText w:val=""/>
+      <w:lvlJc w:val="left"/>
+      <w:pPr>
+        <w:ind w:left="360" w:hanging="360"/>
+      </w:pPr>
+      <w:rPr>
+        <w:rFonts w:ascii="Symbol" w:hAnsi="Symbol" w:hint="default"/>
+      </w:rPr>
+    </w:lvl>
+    <w:lvl w:ilvl="1" w:tplc="04090003" w:tentative="1">
+      <w:start w:val="1"/>
+      <w:numFmt w:val="bullet"/>
+      <w:lvlText w:val="o"/>
+      <w:lvlJc w:val="left"/>
+      <w:pPr>
+        <w:ind w:left="1080" w:hanging="360"/>
+      </w:pPr>
+      <w:rPr>
+        <w:rFonts w:ascii="Courier New" w:hAnsi="Courier New" w:cs="Courier New" w:hint="default"/>
+      </w:rPr>
+    </w:lvl>
+    <w:lvl w:ilvl="2" w:tplc="04090005" w:tentative="1">
+      <w:start w:val="1"/>
+      <w:numFmt w:val="bullet"/>
+      <w:lvlText w:val=""/>
+      <w:lvlJc w:val="left"/>
+      <w:pPr>
+        <w:ind w:left="1800" w:hanging="360"/>
+      </w:pPr>
+      <w:rPr>
+        <w:rFonts w:ascii="Wingdings" w:hAnsi="Wingdings" w:hint="default"/>
+      </w:rPr>
+    </w:lvl>
+    <w:lvl w:ilvl="3" w:tplc="04090001" w:tentative="1">
+      <w:start w:val="1"/>
+      <w:numFmt w:val="bullet"/>
+      <w:lvlText w:val=""/>
+      <w:lvlJc w:val="left"/>
+      <w:pPr>
+        <w:ind w:left="2520" w:hanging="360"/>
+      </w:pPr>
+      <w:rPr>
+        <w:rFonts w:ascii="Symbol" w:hAnsi="Symbol" w:hint="default"/>
+      </w:rPr>
+    </w:lvl>
+    <w:lvl w:ilvl="4" w:tplc="04090003" w:tentative="1">
+      <w:start w:val="1"/>
+      <w:numFmt w:val="bullet"/>
+      <w:lvlText w:val="o"/>
+      <w:lvlJc w:val="left"/>
+      <w:pPr>
+        <w:ind w:left="3240" w:hanging="360"/>
+      </w:pPr>
+      <w:rPr>
+        <w:rFonts w:ascii="Courier New" w:hAnsi="Courier New" w:cs="Courier New" w:hint="default"/>
+      </w:rPr>
+    </w:lvl>
+    <w:lvl w:ilvl="5" w:tplc="04090005" w:tentative="1">
+      <w:start w:val="1"/>
+      <w:numFmt w:val="bullet"/>
+      <w:lvlText w:val=""/>
+      <w:lvlJc w:val="left"/>
+      <w:pPr>
+        <w:ind w:left="3960" w:hanging="360"/>
+      </w:pPr>
+      <w:rPr>
+        <w:rFonts w:ascii="Wingdings" w:hAnsi="Wingdings" w:hint="default"/>
+      </w:rPr>
+    </w:lvl>
+    <w:lvl w:ilvl="6" w:tplc="04090001" w:tentative="1">
+      <w:start w:val="1"/>
+      <w:numFmt w:val="bullet"/>
+      <w:lvlText w:val=""/>
+      <w:lvlJc w:val="left"/>
+      <w:pPr>
+        <w:ind w:left="4680" w:hanging="360"/>
+      </w:pPr>
+      <w:rPr>
+        <w:rFonts w:ascii="Symbol" w:hAnsi="Symbol" w:hint="default"/>
+      </w:rPr>
+    </w:lvl>
+    <w:lvl w:ilvl="7" w:tplc="04090003" w:tentative="1">
+      <w:start w:val="1"/>
+      <w:numFmt w:val="bullet"/>
+      <w:lvlText w:val="o"/>
+      <w:lvlJc w:val="left"/>
+      <w:pPr>
+        <w:ind w:left="5400" w:hanging="360"/>
+      </w:pPr>
+      <w:rPr>
+        <w:rFonts w:ascii="Courier New" w:hAnsi="Courier New" w:cs="Courier New" w:hint="default"/>
+      </w:rPr>
+    </w:lvl>
+    <w:lvl w:ilvl="8" w:tplc="04090005" w:tentative="1">
+      <w:start w:val="1"/>
+      <w:numFmt w:val="bullet"/>
+      <w:lvlText w:val=""/>
+      <w:lvlJc w:val="left"/>
+      <w:pPr>
+        <w:ind w:left="6120" w:hanging="360"/>
+      </w:pPr>
+      <w:rPr>
+        <w:rFonts w:ascii="Wingdings" w:hAnsi="Wingdings" w:hint="default"/>
+      </w:rPr>
+    </w:lvl>
+  </w:abstractNum>
+  <w:abstractNum w:abstractNumId="25" w15:restartNumberingAfterBreak="0">
     <w:nsid w:val="4A237393"/>
     <w:multiLevelType w:val="hybridMultilevel"/>
     <w:tmpl w:val="4782BB36"/>
@@ -14556,7 +17415,7 @@
       </w:rPr>
     </w:lvl>
   </w:abstractNum>
-  <w:abstractNum w:abstractNumId="24" w15:restartNumberingAfterBreak="0">
+  <w:abstractNum w:abstractNumId="26" w15:restartNumberingAfterBreak="0">
     <w:nsid w:val="4A3641F2"/>
     <w:multiLevelType w:val="hybridMultilevel"/>
     <w:tmpl w:val="55A4C6E8"/>
@@ -14669,7 +17528,7 @@
       </w:rPr>
     </w:lvl>
   </w:abstractNum>
-  <w:abstractNum w:abstractNumId="25" w15:restartNumberingAfterBreak="0">
+  <w:abstractNum w:abstractNumId="27" w15:restartNumberingAfterBreak="0">
     <w:nsid w:val="4C7744B4"/>
     <w:multiLevelType w:val="hybridMultilevel"/>
     <w:tmpl w:val="F536E4A8"/>
@@ -14782,7 +17641,7 @@
       </w:rPr>
     </w:lvl>
   </w:abstractNum>
-  <w:abstractNum w:abstractNumId="26" w15:restartNumberingAfterBreak="0">
+  <w:abstractNum w:abstractNumId="28" w15:restartNumberingAfterBreak="0">
     <w:nsid w:val="54D8331E"/>
     <w:multiLevelType w:val="hybridMultilevel"/>
     <w:tmpl w:val="6DBC3E24"/>
@@ -14895,7 +17754,7 @@
       </w:rPr>
     </w:lvl>
   </w:abstractNum>
-  <w:abstractNum w:abstractNumId="27" w15:restartNumberingAfterBreak="0">
+  <w:abstractNum w:abstractNumId="29" w15:restartNumberingAfterBreak="0">
     <w:nsid w:val="55A01DC0"/>
     <w:multiLevelType w:val="hybridMultilevel"/>
     <w:tmpl w:val="E82C902C"/>
@@ -15008,7 +17867,7 @@
       </w:rPr>
     </w:lvl>
   </w:abstractNum>
-  <w:abstractNum w:abstractNumId="28" w15:restartNumberingAfterBreak="0">
+  <w:abstractNum w:abstractNumId="30" w15:restartNumberingAfterBreak="0">
     <w:nsid w:val="567B679A"/>
     <w:multiLevelType w:val="hybridMultilevel"/>
     <w:tmpl w:val="9CAE3F30"/>
@@ -15121,7 +17980,7 @@
       </w:rPr>
     </w:lvl>
   </w:abstractNum>
-  <w:abstractNum w:abstractNumId="29" w15:restartNumberingAfterBreak="0">
+  <w:abstractNum w:abstractNumId="31" w15:restartNumberingAfterBreak="0">
     <w:nsid w:val="5862625F"/>
     <w:multiLevelType w:val="hybridMultilevel"/>
     <w:tmpl w:val="4EEE81CC"/>
@@ -15234,7 +18093,7 @@
       </w:rPr>
     </w:lvl>
   </w:abstractNum>
-  <w:abstractNum w:abstractNumId="30" w15:restartNumberingAfterBreak="0">
+  <w:abstractNum w:abstractNumId="32" w15:restartNumberingAfterBreak="0">
     <w:nsid w:val="5D2F0CE6"/>
     <w:multiLevelType w:val="hybridMultilevel"/>
     <w:tmpl w:val="19E24308"/>
@@ -15347,7 +18206,7 @@
       </w:rPr>
     </w:lvl>
   </w:abstractNum>
-  <w:abstractNum w:abstractNumId="31" w15:restartNumberingAfterBreak="0">
+  <w:abstractNum w:abstractNumId="33" w15:restartNumberingAfterBreak="0">
     <w:nsid w:val="5E4015BD"/>
     <w:multiLevelType w:val="hybridMultilevel"/>
     <w:tmpl w:val="495A6B36"/>
@@ -15460,7 +18319,7 @@
       </w:rPr>
     </w:lvl>
   </w:abstractNum>
-  <w:abstractNum w:abstractNumId="32" w15:restartNumberingAfterBreak="0">
+  <w:abstractNum w:abstractNumId="34" w15:restartNumberingAfterBreak="0">
     <w:nsid w:val="607817EA"/>
     <w:multiLevelType w:val="hybridMultilevel"/>
     <w:tmpl w:val="3A4CD732"/>
@@ -15573,7 +18432,7 @@
       </w:rPr>
     </w:lvl>
   </w:abstractNum>
-  <w:abstractNum w:abstractNumId="33" w15:restartNumberingAfterBreak="0">
+  <w:abstractNum w:abstractNumId="35" w15:restartNumberingAfterBreak="0">
     <w:nsid w:val="6315678D"/>
     <w:multiLevelType w:val="hybridMultilevel"/>
     <w:tmpl w:val="B2A4B02C"/>
@@ -15686,7 +18545,7 @@
       </w:rPr>
     </w:lvl>
   </w:abstractNum>
-  <w:abstractNum w:abstractNumId="34" w15:restartNumberingAfterBreak="0">
+  <w:abstractNum w:abstractNumId="36" w15:restartNumberingAfterBreak="0">
     <w:nsid w:val="650711E6"/>
     <w:multiLevelType w:val="hybridMultilevel"/>
     <w:tmpl w:val="CCAA5394"/>
@@ -15799,7 +18658,119 @@
       </w:rPr>
     </w:lvl>
   </w:abstractNum>
-  <w:abstractNum w:abstractNumId="35" w15:restartNumberingAfterBreak="0">
+  <w:abstractNum w:abstractNumId="37" w15:restartNumberingAfterBreak="0">
+    <w:nsid w:val="6A1D1E43"/>
+    <w:multiLevelType w:val="hybridMultilevel"/>
+    <w:tmpl w:val="1DDCD232"/>
+    <w:lvl w:ilvl="0" w:tplc="FDD2E8A8">
+      <w:numFmt w:val="bullet"/>
+      <w:lvlText w:val="-"/>
+      <w:lvlJc w:val="left"/>
+      <w:pPr>
+        <w:ind w:left="1140" w:hanging="360"/>
+      </w:pPr>
+      <w:rPr>
+        <w:rFonts w:ascii="Aptos" w:eastAsiaTheme="minorHAnsi" w:hAnsi="Aptos" w:cstheme="minorBidi" w:hint="default"/>
+      </w:rPr>
+    </w:lvl>
+    <w:lvl w:ilvl="1" w:tplc="04090003" w:tentative="1">
+      <w:start w:val="1"/>
+      <w:numFmt w:val="bullet"/>
+      <w:lvlText w:val="o"/>
+      <w:lvlJc w:val="left"/>
+      <w:pPr>
+        <w:ind w:left="1860" w:hanging="360"/>
+      </w:pPr>
+      <w:rPr>
+        <w:rFonts w:ascii="Courier New" w:hAnsi="Courier New" w:cs="Courier New" w:hint="default"/>
+      </w:rPr>
+    </w:lvl>
+    <w:lvl w:ilvl="2" w:tplc="04090005" w:tentative="1">
+      <w:start w:val="1"/>
+      <w:numFmt w:val="bullet"/>
+      <w:lvlText w:val=""/>
+      <w:lvlJc w:val="left"/>
+      <w:pPr>
+        <w:ind w:left="2580" w:hanging="360"/>
+      </w:pPr>
+      <w:rPr>
+        <w:rFonts w:ascii="Wingdings" w:hAnsi="Wingdings" w:hint="default"/>
+      </w:rPr>
+    </w:lvl>
+    <w:lvl w:ilvl="3" w:tplc="04090001" w:tentative="1">
+      <w:start w:val="1"/>
+      <w:numFmt w:val="bullet"/>
+      <w:lvlText w:val=""/>
+      <w:lvlJc w:val="left"/>
+      <w:pPr>
+        <w:ind w:left="3300" w:hanging="360"/>
+      </w:pPr>
+      <w:rPr>
+        <w:rFonts w:ascii="Symbol" w:hAnsi="Symbol" w:hint="default"/>
+      </w:rPr>
+    </w:lvl>
+    <w:lvl w:ilvl="4" w:tplc="04090003" w:tentative="1">
+      <w:start w:val="1"/>
+      <w:numFmt w:val="bullet"/>
+      <w:lvlText w:val="o"/>
+      <w:lvlJc w:val="left"/>
+      <w:pPr>
+        <w:ind w:left="4020" w:hanging="360"/>
+      </w:pPr>
+      <w:rPr>
+        <w:rFonts w:ascii="Courier New" w:hAnsi="Courier New" w:cs="Courier New" w:hint="default"/>
+      </w:rPr>
+    </w:lvl>
+    <w:lvl w:ilvl="5" w:tplc="04090005" w:tentative="1">
+      <w:start w:val="1"/>
+      <w:numFmt w:val="bullet"/>
+      <w:lvlText w:val=""/>
+      <w:lvlJc w:val="left"/>
+      <w:pPr>
+        <w:ind w:left="4740" w:hanging="360"/>
+      </w:pPr>
+      <w:rPr>
+        <w:rFonts w:ascii="Wingdings" w:hAnsi="Wingdings" w:hint="default"/>
+      </w:rPr>
+    </w:lvl>
+    <w:lvl w:ilvl="6" w:tplc="04090001" w:tentative="1">
+      <w:start w:val="1"/>
+      <w:numFmt w:val="bullet"/>
+      <w:lvlText w:val=""/>
+      <w:lvlJc w:val="left"/>
+      <w:pPr>
+        <w:ind w:left="5460" w:hanging="360"/>
+      </w:pPr>
+      <w:rPr>
+        <w:rFonts w:ascii="Symbol" w:hAnsi="Symbol" w:hint="default"/>
+      </w:rPr>
+    </w:lvl>
+    <w:lvl w:ilvl="7" w:tplc="04090003" w:tentative="1">
+      <w:start w:val="1"/>
+      <w:numFmt w:val="bullet"/>
+      <w:lvlText w:val="o"/>
+      <w:lvlJc w:val="left"/>
+      <w:pPr>
+        <w:ind w:left="6180" w:hanging="360"/>
+      </w:pPr>
+      <w:rPr>
+        <w:rFonts w:ascii="Courier New" w:hAnsi="Courier New" w:cs="Courier New" w:hint="default"/>
+      </w:rPr>
+    </w:lvl>
+    <w:lvl w:ilvl="8" w:tplc="04090005" w:tentative="1">
+      <w:start w:val="1"/>
+      <w:numFmt w:val="bullet"/>
+      <w:lvlText w:val=""/>
+      <w:lvlJc w:val="left"/>
+      <w:pPr>
+        <w:ind w:left="6900" w:hanging="360"/>
+      </w:pPr>
+      <w:rPr>
+        <w:rFonts w:ascii="Wingdings" w:hAnsi="Wingdings" w:hint="default"/>
+      </w:rPr>
+    </w:lvl>
+  </w:abstractNum>
+  <w:abstractNum w:abstractNumId="38" w15:restartNumberingAfterBreak="0">
     <w:nsid w:val="6D08275C"/>
     <w:multiLevelType w:val="hybridMultilevel"/>
     <w:tmpl w:val="5D620C96"/>
@@ -15912,7 +18883,7 @@
       </w:rPr>
     </w:lvl>
   </w:abstractNum>
-  <w:abstractNum w:abstractNumId="36" w15:restartNumberingAfterBreak="0">
+  <w:abstractNum w:abstractNumId="39" w15:restartNumberingAfterBreak="0">
     <w:nsid w:val="6F166BC8"/>
     <w:multiLevelType w:val="hybridMultilevel"/>
     <w:tmpl w:val="5450DF0E"/>
@@ -16025,7 +18996,7 @@
       </w:rPr>
     </w:lvl>
   </w:abstractNum>
-  <w:abstractNum w:abstractNumId="37" w15:restartNumberingAfterBreak="0">
+  <w:abstractNum w:abstractNumId="40" w15:restartNumberingAfterBreak="0">
     <w:nsid w:val="74AB02A7"/>
     <w:multiLevelType w:val="hybridMultilevel"/>
     <w:tmpl w:val="C99054E4"/>
@@ -16138,7 +19109,7 @@
       </w:rPr>
     </w:lvl>
   </w:abstractNum>
-  <w:abstractNum w:abstractNumId="38" w15:restartNumberingAfterBreak="0">
+  <w:abstractNum w:abstractNumId="41" w15:restartNumberingAfterBreak="0">
     <w:nsid w:val="7681171A"/>
     <w:multiLevelType w:val="hybridMultilevel"/>
     <w:tmpl w:val="071AEE76"/>
@@ -16251,7 +19222,7 @@
       </w:rPr>
     </w:lvl>
   </w:abstractNum>
-  <w:abstractNum w:abstractNumId="39" w15:restartNumberingAfterBreak="0">
+  <w:abstractNum w:abstractNumId="42" w15:restartNumberingAfterBreak="0">
     <w:nsid w:val="7A433030"/>
     <w:multiLevelType w:val="hybridMultilevel"/>
     <w:tmpl w:val="C5E68486"/>
@@ -16364,7 +19335,7 @@
       </w:rPr>
     </w:lvl>
   </w:abstractNum>
-  <w:abstractNum w:abstractNumId="40" w15:restartNumberingAfterBreak="0">
+  <w:abstractNum w:abstractNumId="43" w15:restartNumberingAfterBreak="0">
     <w:nsid w:val="7E5E1FEA"/>
     <w:multiLevelType w:val="hybridMultilevel"/>
     <w:tmpl w:val="1C64914A"/>
@@ -16477,7 +19448,7 @@
       </w:rPr>
     </w:lvl>
   </w:abstractNum>
-  <w:abstractNum w:abstractNumId="41" w15:restartNumberingAfterBreak="0">
+  <w:abstractNum w:abstractNumId="44" w15:restartNumberingAfterBreak="0">
     <w:nsid w:val="7EC8258B"/>
     <w:multiLevelType w:val="hybridMultilevel"/>
     <w:tmpl w:val="0616F9F2"/>
@@ -16590,7 +19561,7 @@
       </w:rPr>
     </w:lvl>
   </w:abstractNum>
-  <w:abstractNum w:abstractNumId="42" w15:restartNumberingAfterBreak="0">
+  <w:abstractNum w:abstractNumId="45" w15:restartNumberingAfterBreak="0">
     <w:nsid w:val="7EEB4865"/>
     <w:multiLevelType w:val="hybridMultilevel"/>
     <w:tmpl w:val="08F63770"/>
@@ -16704,19 +19675,19 @@
     </w:lvl>
   </w:abstractNum>
   <w:num w:numId="1" w16cid:durableId="115415679">
-    <w:abstractNumId w:val="21"/>
+    <w:abstractNumId w:val="22"/>
   </w:num>
   <w:num w:numId="2" w16cid:durableId="1190333084">
-    <w:abstractNumId w:val="22"/>
+    <w:abstractNumId w:val="23"/>
   </w:num>
   <w:num w:numId="3" w16cid:durableId="1655184505">
     <w:abstractNumId w:val="2"/>
   </w:num>
   <w:num w:numId="4" w16cid:durableId="407583132">
-    <w:abstractNumId w:val="29"/>
+    <w:abstractNumId w:val="31"/>
   </w:num>
   <w:num w:numId="5" w16cid:durableId="2001496723">
-    <w:abstractNumId w:val="26"/>
+    <w:abstractNumId w:val="28"/>
   </w:num>
   <w:num w:numId="6" w16cid:durableId="670909128">
     <w:abstractNumId w:val="13"/>
@@ -16725,16 +19696,16 @@
     <w:abstractNumId w:val="4"/>
   </w:num>
   <w:num w:numId="8" w16cid:durableId="66340676">
-    <w:abstractNumId w:val="16"/>
+    <w:abstractNumId w:val="17"/>
   </w:num>
   <w:num w:numId="9" w16cid:durableId="128591684">
     <w:abstractNumId w:val="3"/>
   </w:num>
   <w:num w:numId="10" w16cid:durableId="842428818">
-    <w:abstractNumId w:val="18"/>
+    <w:abstractNumId w:val="19"/>
   </w:num>
   <w:num w:numId="11" w16cid:durableId="252587664">
-    <w:abstractNumId w:val="41"/>
+    <w:abstractNumId w:val="44"/>
   </w:num>
   <w:num w:numId="12" w16cid:durableId="1864441290">
     <w:abstractNumId w:val="0"/>
@@ -16743,49 +19714,49 @@
     <w:abstractNumId w:val="1"/>
   </w:num>
   <w:num w:numId="14" w16cid:durableId="1631594971">
-    <w:abstractNumId w:val="38"/>
+    <w:abstractNumId w:val="41"/>
   </w:num>
   <w:num w:numId="15" w16cid:durableId="674918877">
-    <w:abstractNumId w:val="37"/>
+    <w:abstractNumId w:val="40"/>
   </w:num>
   <w:num w:numId="16" w16cid:durableId="1276403776">
-    <w:abstractNumId w:val="20"/>
+    <w:abstractNumId w:val="21"/>
   </w:num>
   <w:num w:numId="17" w16cid:durableId="2112041985">
-    <w:abstractNumId w:val="23"/>
+    <w:abstractNumId w:val="25"/>
   </w:num>
   <w:num w:numId="18" w16cid:durableId="1646738210">
-    <w:abstractNumId w:val="15"/>
+    <w:abstractNumId w:val="16"/>
   </w:num>
   <w:num w:numId="19" w16cid:durableId="226309148">
-    <w:abstractNumId w:val="34"/>
+    <w:abstractNumId w:val="36"/>
   </w:num>
   <w:num w:numId="20" w16cid:durableId="680207219">
     <w:abstractNumId w:val="14"/>
   </w:num>
   <w:num w:numId="21" w16cid:durableId="826046621">
-    <w:abstractNumId w:val="36"/>
+    <w:abstractNumId w:val="39"/>
   </w:num>
   <w:num w:numId="22" w16cid:durableId="500968977">
-    <w:abstractNumId w:val="40"/>
+    <w:abstractNumId w:val="43"/>
   </w:num>
   <w:num w:numId="23" w16cid:durableId="1245991022">
-    <w:abstractNumId w:val="32"/>
+    <w:abstractNumId w:val="34"/>
   </w:num>
   <w:num w:numId="24" w16cid:durableId="464350958">
-    <w:abstractNumId w:val="31"/>
+    <w:abstractNumId w:val="33"/>
   </w:num>
   <w:num w:numId="25" w16cid:durableId="1540583620">
-    <w:abstractNumId w:val="33"/>
+    <w:abstractNumId w:val="35"/>
   </w:num>
   <w:num w:numId="26" w16cid:durableId="1796827146">
     <w:abstractNumId w:val="8"/>
   </w:num>
   <w:num w:numId="27" w16cid:durableId="631133297">
-    <w:abstractNumId w:val="17"/>
+    <w:abstractNumId w:val="18"/>
   </w:num>
   <w:num w:numId="28" w16cid:durableId="1958487334">
-    <w:abstractNumId w:val="30"/>
+    <w:abstractNumId w:val="32"/>
   </w:num>
   <w:num w:numId="29" w16cid:durableId="1300577738">
     <w:abstractNumId w:val="12"/>
@@ -16794,25 +19765,25 @@
     <w:abstractNumId w:val="7"/>
   </w:num>
   <w:num w:numId="31" w16cid:durableId="361828090">
-    <w:abstractNumId w:val="19"/>
+    <w:abstractNumId w:val="20"/>
   </w:num>
   <w:num w:numId="32" w16cid:durableId="445582602">
-    <w:abstractNumId w:val="39"/>
+    <w:abstractNumId w:val="42"/>
   </w:num>
   <w:num w:numId="33" w16cid:durableId="1461458438">
     <w:abstractNumId w:val="6"/>
   </w:num>
   <w:num w:numId="34" w16cid:durableId="278999216">
-    <w:abstractNumId w:val="42"/>
+    <w:abstractNumId w:val="45"/>
   </w:num>
   <w:num w:numId="35" w16cid:durableId="1837186236">
-    <w:abstractNumId w:val="24"/>
+    <w:abstractNumId w:val="26"/>
   </w:num>
   <w:num w:numId="36" w16cid:durableId="1070808878">
     <w:abstractNumId w:val="9"/>
   </w:num>
   <w:num w:numId="37" w16cid:durableId="1915161235">
-    <w:abstractNumId w:val="25"/>
+    <w:abstractNumId w:val="27"/>
   </w:num>
   <w:num w:numId="38" w16cid:durableId="894509588">
     <w:abstractNumId w:val="10"/>
@@ -16821,16 +19792,25 @@
     <w:abstractNumId w:val="5"/>
   </w:num>
   <w:num w:numId="40" w16cid:durableId="1617055824">
-    <w:abstractNumId w:val="28"/>
+    <w:abstractNumId w:val="30"/>
   </w:num>
   <w:num w:numId="41" w16cid:durableId="433089403">
     <w:abstractNumId w:val="11"/>
   </w:num>
   <w:num w:numId="42" w16cid:durableId="349530848">
-    <w:abstractNumId w:val="35"/>
+    <w:abstractNumId w:val="38"/>
   </w:num>
   <w:num w:numId="43" w16cid:durableId="1738937060">
-    <w:abstractNumId w:val="27"/>
+    <w:abstractNumId w:val="29"/>
+  </w:num>
+  <w:num w:numId="44" w16cid:durableId="997534010">
+    <w:abstractNumId w:val="24"/>
+  </w:num>
+  <w:num w:numId="45" w16cid:durableId="1157843967">
+    <w:abstractNumId w:val="15"/>
+  </w:num>
+  <w:num w:numId="46" w16cid:durableId="2000697083">
+    <w:abstractNumId w:val="37"/>
   </w:num>
 </w:numbering>
 </file>

</xml_diff>